<commit_message>
att doc com empresa
</commit_message>
<xml_diff>
--- a/Documentos/Documento - Projeto de Extensão - COM Empresa.docx
+++ b/Documentos/Documento - Projeto de Extensão - COM Empresa.docx
@@ -1,6 +1,6 @@
 
 <file path=word/document.xml><?xml version="1.0" encoding="utf-8"?>
-<w:document xmlns:wpc="http://schemas.microsoft.com/office/word/2010/wordprocessingCanvas" xmlns:cx="http://schemas.microsoft.com/office/drawing/2014/chartex" xmlns:cx1="http://schemas.microsoft.com/office/drawing/2015/9/8/chartex" xmlns:cx2="http://schemas.microsoft.com/office/drawing/2015/10/21/chartex" xmlns:cx3="http://schemas.microsoft.com/office/drawing/2016/5/9/chartex" xmlns:cx4="http://schemas.microsoft.com/office/drawing/2016/5/10/chartex" xmlns:cx5="http://schemas.microsoft.com/office/drawing/2016/5/11/chartex" xmlns:cx6="http://schemas.microsoft.com/office/drawing/2016/5/12/chartex" xmlns:cx7="http://schemas.microsoft.com/office/drawing/2016/5/13/chartex" xmlns:cx8="http://schemas.microsoft.com/office/drawing/2016/5/14/chartex" xmlns:mc="http://schemas.openxmlformats.org/markup-compatibility/2006" xmlns:aink="http://schemas.microsoft.com/office/drawing/2016/ink" xmlns:am3d="http://schemas.microsoft.com/office/drawing/2017/model3d" xmlns:o="urn:schemas-microsoft-com:office:office" xmlns:oel="http://schemas.microsoft.com/office/2019/extlst" xmlns:r="http://schemas.openxmlformats.org/officeDocument/2006/relationships" xmlns:m="http://schemas.openxmlformats.org/officeDocument/2006/math" xmlns:v="urn:schemas-microsoft-com:vml" xmlns:wp14="http://schemas.microsoft.com/office/word/2010/wordprocessingDrawing" xmlns:wp="http://schemas.openxmlformats.org/drawingml/2006/wordprocessingDrawing" xmlns:w10="urn:schemas-microsoft-com:office:word" xmlns:w="http://schemas.openxmlformats.org/wordprocessingml/2006/main" xmlns:w14="http://schemas.microsoft.com/office/word/2010/wordml" xmlns:w15="http://schemas.microsoft.com/office/word/2012/wordml" xmlns:w16cex="http://schemas.microsoft.com/office/word/2018/wordml/cex" xmlns:w16cid="http://schemas.microsoft.com/office/word/2016/wordml/cid" xmlns:w16="http://schemas.microsoft.com/office/word/2018/wordml" xmlns:w16du="http://schemas.microsoft.com/office/word/2023/wordml/word16du" xmlns:w16sdtdh="http://schemas.microsoft.com/office/word/2020/wordml/sdtdatahash" xmlns:w16sdtfl="http://schemas.microsoft.com/office/word/2024/wordml/sdtformatlock" xmlns:w16se="http://schemas.microsoft.com/office/word/2015/wordml/symex" xmlns:wpg="http://schemas.microsoft.com/office/word/2010/wordprocessingGroup" xmlns:wpi="http://schemas.microsoft.com/office/word/2010/wordprocessingInk" xmlns:wne="http://schemas.microsoft.com/office/word/2006/wordml" xmlns:wps="http://schemas.microsoft.com/office/word/2010/wordprocessingShape" mc:Ignorable="w14 w15 w16se w16cid w16 w16cex w16sdtdh w16sdtfl w16du wp14">
+<w:document xmlns:wpc="http://schemas.microsoft.com/office/word/2010/wordprocessingCanvas" xmlns:cx="http://schemas.microsoft.com/office/drawing/2014/chartex" xmlns:cx1="http://schemas.microsoft.com/office/drawing/2015/9/8/chartex" xmlns:cx2="http://schemas.microsoft.com/office/drawing/2015/10/21/chartex" xmlns:cx3="http://schemas.microsoft.com/office/drawing/2016/5/9/chartex" xmlns:cx4="http://schemas.microsoft.com/office/drawing/2016/5/10/chartex" xmlns:cx5="http://schemas.microsoft.com/office/drawing/2016/5/11/chartex" xmlns:cx6="http://schemas.microsoft.com/office/drawing/2016/5/12/chartex" xmlns:cx7="http://schemas.microsoft.com/office/drawing/2016/5/13/chartex" xmlns:cx8="http://schemas.microsoft.com/office/drawing/2016/5/14/chartex" xmlns:mc="http://schemas.openxmlformats.org/markup-compatibility/2006" xmlns:aink="http://schemas.microsoft.com/office/drawing/2016/ink" xmlns:am3d="http://schemas.microsoft.com/office/drawing/2017/model3d" xmlns:o="urn:schemas-microsoft-com:office:office" xmlns:oel="http://schemas.microsoft.com/office/2019/extlst" xmlns:r="http://schemas.openxmlformats.org/officeDocument/2006/relationships" xmlns:m="http://schemas.openxmlformats.org/officeDocument/2006/math" xmlns:v="urn:schemas-microsoft-com:vml" xmlns:wp14="http://schemas.microsoft.com/office/word/2010/wordprocessingDrawing" xmlns:wp="http://schemas.openxmlformats.org/drawingml/2006/wordprocessingDrawing" xmlns:w10="urn:schemas-microsoft-com:office:word" xmlns:w="http://schemas.openxmlformats.org/wordprocessingml/2006/main" xmlns:w14="http://schemas.microsoft.com/office/word/2010/wordml" xmlns:w15="http://schemas.microsoft.com/office/word/2012/wordml" xmlns:w16cex="http://schemas.microsoft.com/office/word/2018/wordml/cex" xmlns:w16cid="http://schemas.microsoft.com/office/word/2016/wordml/cid" xmlns:w16="http://schemas.microsoft.com/office/word/2018/wordml" xmlns:w16sdtdh="http://schemas.microsoft.com/office/word/2020/wordml/sdtdatahash" xmlns:w16se="http://schemas.microsoft.com/office/word/2015/wordml/symex" xmlns:wpg="http://schemas.microsoft.com/office/word/2010/wordprocessingGroup" xmlns:wpi="http://schemas.microsoft.com/office/word/2010/wordprocessingInk" xmlns:wne="http://schemas.microsoft.com/office/word/2006/wordml" xmlns:wps="http://schemas.microsoft.com/office/word/2010/wordprocessingShape" mc:Ignorable="w14 w15 w16se w16cid w16 w16cex w16sdtdh wp14">
   <w:body>
     <w:p>
       <w:pPr>
@@ -135,29 +135,22 @@
             <w:pPr>
               <w:rPr>
                 <w:rFonts w:ascii="Arial" w:eastAsia="Arial" w:hAnsi="Arial" w:cs="Arial"/>
-                <w:color w:val="525252" w:themeColor="accent3" w:themeShade="80"/>
-                <w:sz w:val="20"/>
-                <w:szCs w:val="20"/>
-              </w:rPr>
-            </w:pPr>
-            <w:r>
-              <w:rPr>
-                <w:rFonts w:ascii="Arial" w:eastAsia="Arial" w:hAnsi="Arial" w:cs="Arial"/>
-                <w:color w:val="525252" w:themeColor="accent3" w:themeShade="80"/>
-                <w:sz w:val="20"/>
-                <w:szCs w:val="20"/>
-              </w:rPr>
-              <w:t>Inserir os dados neste espaço. Orientações: descrição sucinta englobando o tema do projeto.</w:t>
-            </w:r>
-          </w:p>
-          <w:p>
-            <w:pPr>
-              <w:rPr>
-                <w:rFonts w:ascii="Arial" w:eastAsia="Arial" w:hAnsi="Arial" w:cs="Arial"/>
-                <w:sz w:val="20"/>
-                <w:szCs w:val="20"/>
-              </w:rPr>
-            </w:pPr>
+                <w:b/>
+                <w:bCs/>
+                <w:sz w:val="20"/>
+                <w:szCs w:val="20"/>
+              </w:rPr>
+            </w:pPr>
+            <w:r>
+              <w:rPr>
+                <w:rFonts w:ascii="Arial" w:eastAsia="Arial" w:hAnsi="Arial" w:cs="Arial"/>
+                <w:b/>
+                <w:bCs/>
+                <w:sz w:val="20"/>
+                <w:szCs w:val="20"/>
+              </w:rPr>
+              <w:t>Projeto Maya Yamamoto - RPG</w:t>
+            </w:r>
           </w:p>
         </w:tc>
       </w:tr>
@@ -323,15 +316,6 @@
                 <w:szCs w:val="20"/>
               </w:rPr>
             </w:pPr>
-            <w:r>
-              <w:rPr>
-                <w:rFonts w:ascii="Arial" w:eastAsia="Arial" w:hAnsi="Arial" w:cs="Arial"/>
-                <w:color w:val="525252" w:themeColor="accent3" w:themeShade="80"/>
-                <w:sz w:val="20"/>
-                <w:szCs w:val="20"/>
-              </w:rPr>
-              <w:t>Preencher aqui</w:t>
-            </w:r>
           </w:p>
           <w:p>
             <w:pPr>
@@ -343,6 +327,15 @@
                 <w:szCs w:val="20"/>
               </w:rPr>
             </w:pPr>
+            <w:r>
+              <w:rPr>
+                <w:rFonts w:ascii="Arial" w:eastAsia="Arial" w:hAnsi="Arial" w:cs="Arial"/>
+                <w:b/>
+                <w:sz w:val="20"/>
+                <w:szCs w:val="20"/>
+              </w:rPr>
+              <w:t>Yuri Santana</w:t>
+            </w:r>
           </w:p>
         </w:tc>
         <w:tc>
@@ -360,6 +353,15 @@
                 <w:szCs w:val="20"/>
               </w:rPr>
             </w:pPr>
+            <w:r>
+              <w:rPr>
+                <w:rFonts w:ascii="Arial" w:eastAsia="Arial" w:hAnsi="Arial" w:cs="Arial"/>
+                <w:b/>
+                <w:sz w:val="20"/>
+                <w:szCs w:val="20"/>
+              </w:rPr>
+              <w:t>25027408</w:t>
+            </w:r>
           </w:p>
         </w:tc>
       </w:tr>
@@ -390,6 +392,15 @@
                 <w:szCs w:val="20"/>
               </w:rPr>
             </w:pPr>
+            <w:r>
+              <w:rPr>
+                <w:rFonts w:ascii="Arial" w:eastAsia="Arial" w:hAnsi="Arial" w:cs="Arial"/>
+                <w:b/>
+                <w:sz w:val="20"/>
+                <w:szCs w:val="20"/>
+              </w:rPr>
+              <w:t>Mauricio Suster</w:t>
+            </w:r>
           </w:p>
         </w:tc>
         <w:tc>
@@ -407,6 +418,15 @@
                 <w:szCs w:val="20"/>
               </w:rPr>
             </w:pPr>
+            <w:r>
+              <w:rPr>
+                <w:rFonts w:ascii="Arial" w:eastAsia="Arial" w:hAnsi="Arial" w:cs="Arial"/>
+                <w:b/>
+                <w:sz w:val="20"/>
+                <w:szCs w:val="20"/>
+              </w:rPr>
+              <w:t>24026985</w:t>
+            </w:r>
           </w:p>
         </w:tc>
       </w:tr>
@@ -437,6 +457,15 @@
                 <w:szCs w:val="20"/>
               </w:rPr>
             </w:pPr>
+            <w:r>
+              <w:rPr>
+                <w:rFonts w:ascii="Arial" w:eastAsia="Arial" w:hAnsi="Arial" w:cs="Arial"/>
+                <w:b/>
+                <w:sz w:val="20"/>
+                <w:szCs w:val="20"/>
+              </w:rPr>
+              <w:t>Igor Almeida</w:t>
+            </w:r>
           </w:p>
         </w:tc>
         <w:tc>
@@ -454,6 +483,15 @@
                 <w:szCs w:val="20"/>
               </w:rPr>
             </w:pPr>
+            <w:r>
+              <w:rPr>
+                <w:rFonts w:ascii="Arial" w:eastAsia="Arial" w:hAnsi="Arial" w:cs="Arial"/>
+                <w:b/>
+                <w:sz w:val="20"/>
+                <w:szCs w:val="20"/>
+              </w:rPr>
+              <w:t>25027173</w:t>
+            </w:r>
           </w:p>
         </w:tc>
       </w:tr>
@@ -484,6 +522,26 @@
                 <w:szCs w:val="20"/>
               </w:rPr>
             </w:pPr>
+            <w:r>
+              <w:rPr>
+                <w:rFonts w:ascii="Arial" w:eastAsia="Arial" w:hAnsi="Arial" w:cs="Arial"/>
+                <w:b/>
+                <w:sz w:val="20"/>
+                <w:szCs w:val="20"/>
+              </w:rPr>
+              <w:t xml:space="preserve">Kaio </w:t>
+            </w:r>
+            <w:proofErr w:type="spellStart"/>
+            <w:r>
+              <w:rPr>
+                <w:rFonts w:ascii="Arial" w:eastAsia="Arial" w:hAnsi="Arial" w:cs="Arial"/>
+                <w:b/>
+                <w:sz w:val="20"/>
+                <w:szCs w:val="20"/>
+              </w:rPr>
+              <w:t>Inglez</w:t>
+            </w:r>
+            <w:proofErr w:type="spellEnd"/>
           </w:p>
         </w:tc>
         <w:tc>
@@ -501,6 +559,15 @@
                 <w:szCs w:val="20"/>
               </w:rPr>
             </w:pPr>
+            <w:r>
+              <w:rPr>
+                <w:rFonts w:ascii="Arial" w:eastAsia="Arial" w:hAnsi="Arial" w:cs="Arial"/>
+                <w:b/>
+                <w:sz w:val="20"/>
+                <w:szCs w:val="20"/>
+              </w:rPr>
+              <w:t>24026741</w:t>
+            </w:r>
           </w:p>
         </w:tc>
       </w:tr>
@@ -597,25 +664,84 @@
                 <w:szCs w:val="20"/>
               </w:rPr>
             </w:pPr>
-            <w:r>
-              <w:rPr>
-                <w:rFonts w:ascii="Arial" w:eastAsia="Arial" w:hAnsi="Arial" w:cs="Arial"/>
-                <w:color w:val="525252" w:themeColor="accent3" w:themeShade="80"/>
-                <w:sz w:val="20"/>
-                <w:szCs w:val="20"/>
-              </w:rPr>
-              <w:t>Inserir os dados neste espaço. Orientações: inserir o nome completo do professor responsável pela Atividade de Extensão.</w:t>
-            </w:r>
+            <w:hyperlink r:id="rId10" w:history="1">
+              <w:r>
+                <w:rPr>
+                  <w:rStyle w:val="Hyperlink"/>
+                  <w:rFonts w:ascii="Arial" w:eastAsia="Arial" w:hAnsi="Arial" w:cs="Arial"/>
+                  <w:b/>
+                  <w:sz w:val="20"/>
+                  <w:szCs w:val="20"/>
+                </w:rPr>
+                <w:t>Katia Bossi</w:t>
+              </w:r>
+            </w:hyperlink>
             <w:r>
               <w:rPr>
                 <w:rFonts w:ascii="Arial" w:eastAsia="Arial" w:hAnsi="Arial" w:cs="Arial"/>
                 <w:b/>
-                <w:color w:val="525252" w:themeColor="accent3" w:themeShade="80"/>
-                <w:sz w:val="16"/>
-                <w:szCs w:val="16"/>
-              </w:rPr>
-              <w:t xml:space="preserve"> </w:t>
-            </w:r>
+                <w:color w:val="000000"/>
+                <w:sz w:val="20"/>
+                <w:szCs w:val="20"/>
+              </w:rPr>
+              <w:t xml:space="preserve">, </w:t>
+            </w:r>
+            <w:hyperlink r:id="rId11" w:history="1">
+              <w:r>
+                <w:rPr>
+                  <w:rStyle w:val="Hyperlink"/>
+                  <w:rFonts w:ascii="Arial" w:eastAsia="Arial" w:hAnsi="Arial" w:cs="Arial"/>
+                  <w:b/>
+                  <w:sz w:val="20"/>
+                  <w:szCs w:val="20"/>
+                </w:rPr>
+                <w:t>Marco Aurélio</w:t>
+              </w:r>
+            </w:hyperlink>
+            <w:r>
+              <w:rPr>
+                <w:rFonts w:ascii="Arial" w:eastAsia="Arial" w:hAnsi="Arial" w:cs="Arial"/>
+                <w:b/>
+                <w:color w:val="000000"/>
+                <w:sz w:val="20"/>
+                <w:szCs w:val="20"/>
+              </w:rPr>
+              <w:t xml:space="preserve">, </w:t>
+            </w:r>
+            <w:hyperlink r:id="rId12" w:history="1">
+              <w:r>
+                <w:rPr>
+                  <w:rStyle w:val="Hyperlink"/>
+                  <w:rFonts w:ascii="Arial" w:eastAsia="Arial" w:hAnsi="Arial" w:cs="Arial"/>
+                  <w:b/>
+                  <w:sz w:val="20"/>
+                  <w:szCs w:val="20"/>
+                </w:rPr>
+                <w:t>Victor Rosetti</w:t>
+              </w:r>
+            </w:hyperlink>
+            <w:r>
+              <w:rPr>
+                <w:rFonts w:ascii="Arial" w:eastAsia="Arial" w:hAnsi="Arial" w:cs="Arial"/>
+                <w:b/>
+                <w:color w:val="000000"/>
+                <w:sz w:val="20"/>
+                <w:szCs w:val="20"/>
+              </w:rPr>
+              <w:t xml:space="preserve"> e </w:t>
+            </w:r>
+            <w:hyperlink r:id="rId13" w:history="1">
+              <w:r>
+                <w:rPr>
+                  <w:rStyle w:val="Hyperlink"/>
+                  <w:rFonts w:ascii="Arial" w:eastAsia="Arial" w:hAnsi="Arial" w:cs="Arial"/>
+                  <w:b/>
+                  <w:sz w:val="20"/>
+                  <w:szCs w:val="20"/>
+                </w:rPr>
+                <w:t>Rodrigo da Rosa</w:t>
+              </w:r>
+            </w:hyperlink>
           </w:p>
         </w:tc>
       </w:tr>
@@ -718,26 +844,7 @@
                 <w:sz w:val="20"/>
                 <w:szCs w:val="20"/>
               </w:rPr>
-              <w:t>Inserir os dados neste espaço. Orientações:</w:t>
-            </w:r>
-            <w:r>
-              <w:rPr>
-                <w:rFonts w:ascii="Arial" w:eastAsia="Arial" w:hAnsi="Arial" w:cs="Arial"/>
-                <w:b/>
-                <w:color w:val="525252" w:themeColor="accent3" w:themeShade="80"/>
-                <w:sz w:val="16"/>
-                <w:szCs w:val="16"/>
-              </w:rPr>
-              <w:t xml:space="preserve"> </w:t>
-            </w:r>
-            <w:r>
-              <w:rPr>
-                <w:rFonts w:ascii="Arial" w:eastAsia="Arial" w:hAnsi="Arial" w:cs="Arial"/>
-                <w:color w:val="525252" w:themeColor="accent3" w:themeShade="80"/>
-                <w:sz w:val="20"/>
-                <w:szCs w:val="20"/>
-              </w:rPr>
-              <w:t>inserir o nome do curso de graduação.</w:t>
+              <w:t xml:space="preserve">Ciência da computação </w:t>
             </w:r>
           </w:p>
         </w:tc>
@@ -910,6 +1017,16 @@
                 <w:szCs w:val="20"/>
               </w:rPr>
             </w:pPr>
+            <w:r>
+              <w:rPr>
+                <w:rFonts w:ascii="Segoe UI Symbol" w:eastAsia="Arial Unicode MS" w:hAnsi="Segoe UI Symbol" w:cs="Segoe UI Symbol"/>
+                <w:b/>
+                <w:color w:val="525252" w:themeColor="accent3" w:themeShade="80"/>
+                <w:sz w:val="16"/>
+                <w:szCs w:val="16"/>
+              </w:rPr>
+              <w:t>✓</w:t>
+            </w:r>
           </w:p>
           <w:p>
             <w:pPr>
@@ -1032,6 +1149,24 @@
                 <w:szCs w:val="20"/>
               </w:rPr>
               <w:t>Atividade de Extensão não implementado na prática (proposta de intervenção)</w:t>
+            </w:r>
+            <w:r>
+              <w:rPr>
+                <w:rFonts w:ascii="Arial" w:eastAsia="Arial" w:hAnsi="Arial" w:cs="Arial"/>
+                <w:sz w:val="20"/>
+                <w:szCs w:val="20"/>
+              </w:rPr>
+              <w:t xml:space="preserve"> </w:t>
+            </w:r>
+            <w:r>
+              <w:rPr>
+                <w:rFonts w:ascii="Segoe UI Symbol" w:eastAsia="Arial Unicode MS" w:hAnsi="Segoe UI Symbol" w:cs="Segoe UI Symbol"/>
+                <w:b/>
+                <w:color w:val="525252" w:themeColor="accent3" w:themeShade="80"/>
+                <w:sz w:val="16"/>
+                <w:szCs w:val="16"/>
+              </w:rPr>
+              <w:t>✓</w:t>
             </w:r>
           </w:p>
           <w:p>
@@ -1131,47 +1266,26 @@
             <w:r>
               <w:rPr>
                 <w:rFonts w:ascii="Arial" w:eastAsia="Arial" w:hAnsi="Arial" w:cs="Arial"/>
-                <w:color w:val="525252" w:themeColor="accent3" w:themeShade="80"/>
-                <w:sz w:val="20"/>
-                <w:szCs w:val="20"/>
-              </w:rPr>
-              <w:t xml:space="preserve">Estabelecido conforme </w:t>
-            </w:r>
-            <w:r>
-              <w:rPr>
-                <w:rFonts w:ascii="Arial" w:eastAsia="Arial" w:hAnsi="Arial" w:cs="Arial"/>
-                <w:color w:val="525252" w:themeColor="accent3" w:themeShade="80"/>
-                <w:sz w:val="20"/>
-                <w:szCs w:val="20"/>
-              </w:rPr>
-              <w:t>seleção da ODS e dos</w:t>
-            </w:r>
-            <w:r>
-              <w:rPr>
-                <w:rFonts w:ascii="Arial" w:eastAsia="Arial" w:hAnsi="Arial" w:cs="Arial"/>
-                <w:color w:val="525252" w:themeColor="accent3" w:themeShade="80"/>
-                <w:sz w:val="20"/>
-                <w:szCs w:val="20"/>
-              </w:rPr>
-              <w:t xml:space="preserve"> conhecimento</w:t>
-            </w:r>
-            <w:r>
-              <w:rPr>
-                <w:rFonts w:ascii="Arial" w:eastAsia="Arial" w:hAnsi="Arial" w:cs="Arial"/>
-                <w:color w:val="525252" w:themeColor="accent3" w:themeShade="80"/>
-                <w:sz w:val="20"/>
-                <w:szCs w:val="20"/>
-              </w:rPr>
-              <w:t>s a</w:t>
-            </w:r>
-            <w:r>
-              <w:rPr>
-                <w:rFonts w:ascii="Arial" w:eastAsia="Arial" w:hAnsi="Arial" w:cs="Arial"/>
-                <w:color w:val="525252" w:themeColor="accent3" w:themeShade="80"/>
-                <w:sz w:val="20"/>
-                <w:szCs w:val="20"/>
-              </w:rPr>
-              <w:t xml:space="preserve"> serem trabalhados e orientações do docente.</w:t>
+                <w:sz w:val="20"/>
+                <w:szCs w:val="20"/>
+              </w:rPr>
+              <w:t xml:space="preserve">O projeto consiste no desenvolvimento de uma solução tecnológica (web e mobile) desenhada para transformar a gestão da </w:t>
+            </w:r>
+            <w:r>
+              <w:rPr>
+                <w:rFonts w:ascii="Arial" w:eastAsia="Arial" w:hAnsi="Arial" w:cs="Arial"/>
+                <w:sz w:val="20"/>
+                <w:szCs w:val="20"/>
+              </w:rPr>
+              <w:t>clínica</w:t>
+            </w:r>
+            <w:r>
+              <w:rPr>
+                <w:rFonts w:ascii="Arial" w:eastAsia="Arial" w:hAnsi="Arial" w:cs="Arial"/>
+                <w:sz w:val="20"/>
+                <w:szCs w:val="20"/>
+              </w:rPr>
+              <w:t>. O objetivo central é eliminar processos manuais, centralizar o controle de pacientes e oferecer uma ferramenta de suporte.</w:t>
             </w:r>
           </w:p>
         </w:tc>
@@ -1401,7 +1515,28 @@
                 <w:sz w:val="20"/>
                 <w:szCs w:val="20"/>
               </w:rPr>
-              <w:t xml:space="preserve">Inserir os dados neste espaço. Orientações: conhecer na prática a realidade do campo de atuação. Definir e descrever o local em que a intervenção prevista na atividade de extensão pode ser implementada, lembrando que não há obrigatoriedade de esta ação ser efetivamente colocada em prática neste momento. É importante considerar intervenções tecnicamente exequíveis, sustentáveis e economicamente viáveis. </w:t>
+              <w:lastRenderedPageBreak/>
+              <w:t xml:space="preserve">A profissional fisioterapeuta Maya </w:t>
+            </w:r>
+            <w:proofErr w:type="spellStart"/>
+            <w:r>
+              <w:rPr>
+                <w:rFonts w:ascii="Arial" w:eastAsia="Arial" w:hAnsi="Arial" w:cs="Arial"/>
+                <w:color w:val="525252" w:themeColor="accent3" w:themeShade="80"/>
+                <w:sz w:val="20"/>
+                <w:szCs w:val="20"/>
+              </w:rPr>
+              <w:t>Yoshiko</w:t>
+            </w:r>
+            <w:proofErr w:type="spellEnd"/>
+            <w:r>
+              <w:rPr>
+                <w:rFonts w:ascii="Arial" w:eastAsia="Arial" w:hAnsi="Arial" w:cs="Arial"/>
+                <w:color w:val="525252" w:themeColor="accent3" w:themeShade="80"/>
+                <w:sz w:val="20"/>
+                <w:szCs w:val="20"/>
+              </w:rPr>
+              <w:t xml:space="preserve"> Yamamoto presta atendimento com foco em Reeducação Postural Global (RPG) e necessita de uma solução digital para melhorar a comunicação com seus pacientes e acompanhar a evolução ao longo do tratamento. Atualmente, parte do acompanhamento é realizado de forma dispersa (mensagens e registros não padronizados), o que dificulta a rastreabilidade do prontuário, o planejamento de exercícios domiciliares e o controle de agenda.</w:t>
             </w:r>
           </w:p>
         </w:tc>
@@ -1473,6 +1608,71 @@
               <w:jc w:val="both"/>
               <w:rPr>
                 <w:rFonts w:ascii="Arial" w:eastAsia="Arial" w:hAnsi="Arial" w:cs="Arial"/>
+                <w:color w:val="525252" w:themeColor="accent3" w:themeShade="80"/>
+                <w:sz w:val="20"/>
+                <w:szCs w:val="20"/>
+              </w:rPr>
+            </w:pPr>
+            <w:r>
+              <w:rPr>
+                <w:rFonts w:ascii="Arial" w:eastAsia="Arial" w:hAnsi="Arial" w:cs="Arial"/>
+                <w:color w:val="525252" w:themeColor="accent3" w:themeShade="80"/>
+                <w:sz w:val="20"/>
+                <w:szCs w:val="20"/>
+              </w:rPr>
+              <w:t xml:space="preserve">O publico alvo são pessoas 30+ </w:t>
+            </w:r>
+          </w:p>
+          <w:p>
+            <w:pPr>
+              <w:pBdr>
+                <w:top w:val="nil"/>
+                <w:left w:val="nil"/>
+                <w:bottom w:val="nil"/>
+                <w:right w:val="nil"/>
+                <w:between w:val="nil"/>
+              </w:pBdr>
+              <w:spacing w:after="0" w:line="240" w:lineRule="auto"/>
+              <w:jc w:val="both"/>
+              <w:rPr>
+                <w:rFonts w:ascii="Arial" w:eastAsia="Arial" w:hAnsi="Arial" w:cs="Arial"/>
+                <w:color w:val="525252" w:themeColor="accent3" w:themeShade="80"/>
+                <w:sz w:val="20"/>
+                <w:szCs w:val="20"/>
+              </w:rPr>
+            </w:pPr>
+            <w:r>
+              <w:rPr>
+                <w:rFonts w:ascii="Arial" w:eastAsia="Arial" w:hAnsi="Arial" w:cs="Arial"/>
+                <w:color w:val="525252" w:themeColor="accent3" w:themeShade="80"/>
+                <w:sz w:val="20"/>
+                <w:szCs w:val="20"/>
+              </w:rPr>
+              <w:t xml:space="preserve">Voltada para adultos e idosos </w:t>
+            </w:r>
+            <w:r>
+              <w:rPr>
+                <w:rFonts w:ascii="Arial" w:eastAsia="Arial" w:hAnsi="Arial" w:cs="Arial"/>
+                <w:color w:val="525252" w:themeColor="accent3" w:themeShade="80"/>
+                <w:sz w:val="20"/>
+                <w:szCs w:val="20"/>
+              </w:rPr>
+              <w:t xml:space="preserve"> </w:t>
+            </w:r>
+          </w:p>
+          <w:p>
+            <w:pPr>
+              <w:pBdr>
+                <w:top w:val="nil"/>
+                <w:left w:val="nil"/>
+                <w:bottom w:val="nil"/>
+                <w:right w:val="nil"/>
+                <w:between w:val="nil"/>
+              </w:pBdr>
+              <w:spacing w:after="0" w:line="240" w:lineRule="auto"/>
+              <w:jc w:val="both"/>
+              <w:rPr>
+                <w:rFonts w:ascii="Arial" w:eastAsia="Arial" w:hAnsi="Arial" w:cs="Arial"/>
                 <w:color w:val="1F4E79"/>
                 <w:sz w:val="20"/>
                 <w:szCs w:val="20"/>
@@ -1481,11 +1681,11 @@
             <w:r>
               <w:rPr>
                 <w:rFonts w:ascii="Arial" w:eastAsia="Arial" w:hAnsi="Arial" w:cs="Arial"/>
-                <w:color w:val="525252" w:themeColor="accent3" w:themeShade="80"/>
-                <w:sz w:val="20"/>
-                <w:szCs w:val="20"/>
-              </w:rPr>
-              <w:t xml:space="preserve">Inserir os dados neste espaço. Orientações: buscar conhecer na prática a realidade do campo de atuação para a intervenção extensionista. Definir os sujeitos que poderão ser impactados pela intervenção. Caracterizar o público-alvo, características socioeconômicas e educacionais ou outros dados considerados relevantes. Nesta etapa poderá ser realizado um levantamento diagnóstico da comunidade, os dados podem ser obtidos na prática com base na metodologia proposta para o projeto de extensão (visitas, entrevistas, questionários, reuniões, roda de conversa, ou uso de outras ferramentas de levantamento). Adequar a proposta de acordo com as especificidades do curso. Os dados aqui inseridos também podem ser empregados na concepção do projeto propriamente dito. </w:t>
+                <w:color w:val="000000"/>
+                <w:sz w:val="20"/>
+                <w:szCs w:val="20"/>
+              </w:rPr>
+              <w:t>O público-alvo são profissionais de fisioterapia e seus pacientes.</w:t>
             </w:r>
           </w:p>
         </w:tc>
@@ -1556,39 +1756,168 @@
               <w:jc w:val="both"/>
               <w:rPr>
                 <w:rFonts w:ascii="Arial" w:eastAsia="Arial" w:hAnsi="Arial" w:cs="Arial"/>
+                <w:color w:val="525252" w:themeColor="accent3" w:themeShade="80"/>
+                <w:sz w:val="20"/>
+                <w:szCs w:val="20"/>
+              </w:rPr>
+            </w:pPr>
+            <w:r>
+              <w:rPr>
+                <w:rFonts w:ascii="Arial" w:eastAsia="Arial" w:hAnsi="Arial" w:cs="Arial"/>
+                <w:color w:val="525252" w:themeColor="accent3" w:themeShade="80"/>
+                <w:sz w:val="20"/>
+                <w:szCs w:val="20"/>
+              </w:rPr>
+              <w:t>Observou-se que o processo de registro clínico e prescrição de exercícios é realizado de forma inteiramente manual. Essa falta de automação resulta em:</w:t>
+            </w:r>
+          </w:p>
+          <w:p>
+            <w:pPr>
+              <w:numPr>
+                <w:ilvl w:val="0"/>
+                <w:numId w:val="3"/>
+              </w:numPr>
+              <w:pBdr>
+                <w:top w:val="nil"/>
+                <w:left w:val="nil"/>
+                <w:bottom w:val="nil"/>
+                <w:right w:val="nil"/>
+                <w:between w:val="nil"/>
+              </w:pBdr>
+              <w:spacing w:after="0" w:line="240" w:lineRule="auto"/>
+              <w:jc w:val="both"/>
+              <w:rPr>
+                <w:rFonts w:ascii="Arial" w:eastAsia="Arial" w:hAnsi="Arial" w:cs="Arial"/>
+                <w:color w:val="525252" w:themeColor="accent3" w:themeShade="80"/>
+                <w:sz w:val="20"/>
+                <w:szCs w:val="20"/>
+              </w:rPr>
+            </w:pPr>
+            <w:r>
+              <w:rPr>
+                <w:rFonts w:ascii="Arial" w:eastAsia="Arial" w:hAnsi="Arial" w:cs="Arial"/>
+                <w:b/>
+                <w:bCs/>
+                <w:color w:val="525252" w:themeColor="accent3" w:themeShade="80"/>
+                <w:sz w:val="20"/>
+                <w:szCs w:val="20"/>
+              </w:rPr>
+              <w:t>Processos repetitivos</w:t>
+            </w:r>
+            <w:r>
+              <w:rPr>
+                <w:rFonts w:ascii="Arial" w:eastAsia="Arial" w:hAnsi="Arial" w:cs="Arial"/>
+                <w:color w:val="525252" w:themeColor="accent3" w:themeShade="80"/>
+                <w:sz w:val="20"/>
+                <w:szCs w:val="20"/>
+              </w:rPr>
+              <w:t>: Perda de tempo em tarefas administrativas que poderiam ser automatizadas.</w:t>
+            </w:r>
+          </w:p>
+          <w:p>
+            <w:pPr>
+              <w:numPr>
+                <w:ilvl w:val="0"/>
+                <w:numId w:val="3"/>
+              </w:numPr>
+              <w:pBdr>
+                <w:top w:val="nil"/>
+                <w:left w:val="nil"/>
+                <w:bottom w:val="nil"/>
+                <w:right w:val="nil"/>
+                <w:between w:val="nil"/>
+              </w:pBdr>
+              <w:spacing w:after="0" w:line="240" w:lineRule="auto"/>
+              <w:jc w:val="both"/>
+              <w:rPr>
+                <w:rFonts w:ascii="Arial" w:eastAsia="Arial" w:hAnsi="Arial" w:cs="Arial"/>
+                <w:color w:val="525252" w:themeColor="accent3" w:themeShade="80"/>
+                <w:sz w:val="20"/>
+                <w:szCs w:val="20"/>
+              </w:rPr>
+            </w:pPr>
+            <w:r>
+              <w:rPr>
+                <w:rFonts w:ascii="Arial" w:eastAsia="Arial" w:hAnsi="Arial" w:cs="Arial"/>
+                <w:b/>
+                <w:bCs/>
+                <w:color w:val="525252" w:themeColor="accent3" w:themeShade="80"/>
+                <w:sz w:val="20"/>
+                <w:szCs w:val="20"/>
+              </w:rPr>
+              <w:t>Risco de perda de dados</w:t>
+            </w:r>
+            <w:r>
+              <w:rPr>
+                <w:rFonts w:ascii="Arial" w:eastAsia="Arial" w:hAnsi="Arial" w:cs="Arial"/>
+                <w:color w:val="525252" w:themeColor="accent3" w:themeShade="80"/>
+                <w:sz w:val="20"/>
+                <w:szCs w:val="20"/>
+              </w:rPr>
+              <w:t>: Informações de saúde sensíveis armazenadas apenas em meio físico.</w:t>
+            </w:r>
+          </w:p>
+          <w:p>
+            <w:pPr>
+              <w:numPr>
+                <w:ilvl w:val="0"/>
+                <w:numId w:val="3"/>
+              </w:numPr>
+              <w:pBdr>
+                <w:top w:val="nil"/>
+                <w:left w:val="nil"/>
+                <w:bottom w:val="nil"/>
+                <w:right w:val="nil"/>
+                <w:between w:val="nil"/>
+              </w:pBdr>
+              <w:spacing w:after="0" w:line="240" w:lineRule="auto"/>
+              <w:jc w:val="both"/>
+              <w:rPr>
+                <w:rFonts w:ascii="Arial" w:eastAsia="Arial" w:hAnsi="Arial" w:cs="Arial"/>
+                <w:color w:val="525252" w:themeColor="accent3" w:themeShade="80"/>
+                <w:sz w:val="20"/>
+                <w:szCs w:val="20"/>
+              </w:rPr>
+            </w:pPr>
+            <w:r>
+              <w:rPr>
+                <w:rFonts w:ascii="Arial" w:eastAsia="Arial" w:hAnsi="Arial" w:cs="Arial"/>
+                <w:b/>
+                <w:bCs/>
+                <w:color w:val="525252" w:themeColor="accent3" w:themeShade="80"/>
+                <w:sz w:val="20"/>
+                <w:szCs w:val="20"/>
+              </w:rPr>
+              <w:t>Dificuldade de acompanhamento</w:t>
+            </w:r>
+            <w:r>
+              <w:rPr>
+                <w:rFonts w:ascii="Arial" w:eastAsia="Arial" w:hAnsi="Arial" w:cs="Arial"/>
+                <w:color w:val="525252" w:themeColor="accent3" w:themeShade="80"/>
+                <w:sz w:val="20"/>
+                <w:szCs w:val="20"/>
+              </w:rPr>
+              <w:t>: Obstáculos na análise da evolução histórica do paciente devido à fragmentação dos registros em papel.</w:t>
+            </w:r>
+          </w:p>
+          <w:p>
+            <w:pPr>
+              <w:pBdr>
+                <w:top w:val="nil"/>
+                <w:left w:val="nil"/>
+                <w:bottom w:val="nil"/>
+                <w:right w:val="nil"/>
+                <w:between w:val="nil"/>
+              </w:pBdr>
+              <w:spacing w:after="0" w:line="240" w:lineRule="auto"/>
+              <w:jc w:val="both"/>
+              <w:rPr>
+                <w:rFonts w:ascii="Arial" w:eastAsia="Arial" w:hAnsi="Arial" w:cs="Arial"/>
                 <w:color w:val="1F4E79"/>
                 <w:sz w:val="20"/>
                 <w:szCs w:val="20"/>
               </w:rPr>
             </w:pPr>
-            <w:r>
-              <w:rPr>
-                <w:rFonts w:ascii="Arial" w:eastAsia="Arial" w:hAnsi="Arial" w:cs="Arial"/>
-                <w:color w:val="525252" w:themeColor="accent3" w:themeShade="80"/>
-                <w:sz w:val="20"/>
-                <w:szCs w:val="20"/>
-              </w:rPr>
-              <w:t>Inserir os dados neste espaço. Orientações:</w:t>
-            </w:r>
-            <w:r>
-              <w:rPr>
-                <w:rFonts w:ascii="Arial" w:eastAsia="Arial" w:hAnsi="Arial" w:cs="Arial"/>
-                <w:b/>
-                <w:color w:val="525252" w:themeColor="accent3" w:themeShade="80"/>
-                <w:sz w:val="16"/>
-                <w:szCs w:val="16"/>
-              </w:rPr>
-              <w:t xml:space="preserve"> </w:t>
-            </w:r>
-            <w:r>
-              <w:rPr>
-                <w:rFonts w:ascii="Arial" w:eastAsia="Arial" w:hAnsi="Arial" w:cs="Arial"/>
-                <w:color w:val="525252" w:themeColor="accent3" w:themeShade="80"/>
-                <w:sz w:val="20"/>
-                <w:szCs w:val="20"/>
-              </w:rPr>
-              <w:t xml:space="preserve">observar a realidade em si, identificar os postos-chave, os problemas apontados e suas características para que o plano de intervenção possa contribuir na transformação da realidade observada. Selecionar o problema que será objeto da intervenção e apresentar argumentos relativos à sua relevância de estudo. Os dados aqui inseridos também podem ser empregados na concepção do projeto propriamente dito. </w:t>
-            </w:r>
           </w:p>
         </w:tc>
       </w:tr>
@@ -1658,49 +1987,155 @@
               <w:jc w:val="both"/>
               <w:rPr>
                 <w:rFonts w:ascii="Arial" w:eastAsia="Arial" w:hAnsi="Arial" w:cs="Arial"/>
+                <w:color w:val="525252" w:themeColor="accent3" w:themeShade="80"/>
+                <w:sz w:val="20"/>
+                <w:szCs w:val="20"/>
+              </w:rPr>
+            </w:pPr>
+            <w:r>
+              <w:rPr>
+                <w:rFonts w:ascii="Arial" w:eastAsia="Arial" w:hAnsi="Arial" w:cs="Arial"/>
+                <w:color w:val="525252" w:themeColor="accent3" w:themeShade="80"/>
+                <w:sz w:val="20"/>
+                <w:szCs w:val="20"/>
+              </w:rPr>
+              <w:t>A hipótese central é que a implementação do </w:t>
+            </w:r>
+            <w:r>
+              <w:rPr>
+                <w:rFonts w:ascii="Arial" w:eastAsia="Arial" w:hAnsi="Arial" w:cs="Arial"/>
+                <w:b/>
+                <w:bCs/>
+                <w:color w:val="525252" w:themeColor="accent3" w:themeShade="80"/>
+                <w:sz w:val="20"/>
+                <w:szCs w:val="20"/>
+              </w:rPr>
+              <w:t>Maya System</w:t>
+            </w:r>
+            <w:r>
+              <w:rPr>
+                <w:rFonts w:ascii="Arial" w:eastAsia="Arial" w:hAnsi="Arial" w:cs="Arial"/>
+                <w:color w:val="525252" w:themeColor="accent3" w:themeShade="80"/>
+                <w:sz w:val="20"/>
+                <w:szCs w:val="20"/>
+              </w:rPr>
+              <w:t> — um ecossistema de software composto por uma aplicação web e uma versão mobile — automatizará o fluxo de trabalho da clínica. A solução proposta inclui:</w:t>
+            </w:r>
+          </w:p>
+          <w:p>
+            <w:pPr>
+              <w:numPr>
+                <w:ilvl w:val="0"/>
+                <w:numId w:val="4"/>
+              </w:numPr>
+              <w:pBdr>
+                <w:top w:val="nil"/>
+                <w:left w:val="nil"/>
+                <w:bottom w:val="nil"/>
+                <w:right w:val="nil"/>
+                <w:between w:val="nil"/>
+              </w:pBdr>
+              <w:spacing w:after="0" w:line="240" w:lineRule="auto"/>
+              <w:jc w:val="both"/>
+              <w:rPr>
+                <w:rFonts w:ascii="Arial" w:eastAsia="Arial" w:hAnsi="Arial" w:cs="Arial"/>
+                <w:color w:val="525252" w:themeColor="accent3" w:themeShade="80"/>
+                <w:sz w:val="20"/>
+                <w:szCs w:val="20"/>
+              </w:rPr>
+            </w:pPr>
+            <w:r>
+              <w:rPr>
+                <w:rFonts w:ascii="Arial" w:eastAsia="Arial" w:hAnsi="Arial" w:cs="Arial"/>
+                <w:color w:val="525252" w:themeColor="accent3" w:themeShade="80"/>
+                <w:sz w:val="20"/>
+                <w:szCs w:val="20"/>
+              </w:rPr>
+              <w:t>Digitalização de prontuários e registros clínicos.</w:t>
+            </w:r>
+          </w:p>
+          <w:p>
+            <w:pPr>
+              <w:numPr>
+                <w:ilvl w:val="0"/>
+                <w:numId w:val="4"/>
+              </w:numPr>
+              <w:pBdr>
+                <w:top w:val="nil"/>
+                <w:left w:val="nil"/>
+                <w:bottom w:val="nil"/>
+                <w:right w:val="nil"/>
+                <w:between w:val="nil"/>
+              </w:pBdr>
+              <w:spacing w:after="0" w:line="240" w:lineRule="auto"/>
+              <w:jc w:val="both"/>
+              <w:rPr>
+                <w:rFonts w:ascii="Arial" w:eastAsia="Arial" w:hAnsi="Arial" w:cs="Arial"/>
+                <w:color w:val="525252" w:themeColor="accent3" w:themeShade="80"/>
+                <w:sz w:val="20"/>
+                <w:szCs w:val="20"/>
+              </w:rPr>
+            </w:pPr>
+            <w:r>
+              <w:rPr>
+                <w:rFonts w:ascii="Arial" w:eastAsia="Arial" w:hAnsi="Arial" w:cs="Arial"/>
+                <w:color w:val="525252" w:themeColor="accent3" w:themeShade="80"/>
+                <w:sz w:val="20"/>
+                <w:szCs w:val="20"/>
+              </w:rPr>
+              <w:t>Módulo de prescrição de exercícios para RPG.</w:t>
+            </w:r>
+          </w:p>
+          <w:p>
+            <w:pPr>
+              <w:numPr>
+                <w:ilvl w:val="0"/>
+                <w:numId w:val="4"/>
+              </w:numPr>
+              <w:pBdr>
+                <w:top w:val="nil"/>
+                <w:left w:val="nil"/>
+                <w:bottom w:val="nil"/>
+                <w:right w:val="nil"/>
+                <w:between w:val="nil"/>
+              </w:pBdr>
+              <w:spacing w:after="0" w:line="240" w:lineRule="auto"/>
+              <w:jc w:val="both"/>
+              <w:rPr>
+                <w:rFonts w:ascii="Arial" w:eastAsia="Arial" w:hAnsi="Arial" w:cs="Arial"/>
+                <w:color w:val="525252" w:themeColor="accent3" w:themeShade="80"/>
+                <w:sz w:val="20"/>
+                <w:szCs w:val="20"/>
+              </w:rPr>
+            </w:pPr>
+            <w:r>
+              <w:rPr>
+                <w:rFonts w:ascii="Arial" w:eastAsia="Arial" w:hAnsi="Arial" w:cs="Arial"/>
+                <w:color w:val="525252" w:themeColor="accent3" w:themeShade="80"/>
+                <w:sz w:val="20"/>
+                <w:szCs w:val="20"/>
+              </w:rPr>
+              <w:t>Uso de infraestrutura em nuvem (AWS) para garantir a disponibilidade e segurança dos dados, seguindo o modelo de responsabilidade compartilhada.</w:t>
+            </w:r>
+          </w:p>
+          <w:p>
+            <w:pPr>
+              <w:pBdr>
+                <w:top w:val="nil"/>
+                <w:left w:val="nil"/>
+                <w:bottom w:val="nil"/>
+                <w:right w:val="nil"/>
+                <w:between w:val="nil"/>
+              </w:pBdr>
+              <w:spacing w:after="0" w:line="240" w:lineRule="auto"/>
+              <w:jc w:val="both"/>
+              <w:rPr>
+                <w:rFonts w:ascii="Arial" w:eastAsia="Arial" w:hAnsi="Arial" w:cs="Arial"/>
                 <w:color w:val="FF3333"/>
                 <w:sz w:val="20"/>
                 <w:szCs w:val="20"/>
               </w:rPr>
             </w:pPr>
-            <w:r>
-              <w:rPr>
-                <w:rFonts w:ascii="Arial" w:eastAsia="Arial" w:hAnsi="Arial" w:cs="Arial"/>
-                <w:color w:val="525252" w:themeColor="accent3" w:themeShade="80"/>
-                <w:sz w:val="20"/>
-                <w:szCs w:val="20"/>
-              </w:rPr>
-              <w:t>Inserir os dados neste espaço. Orientações:</w:t>
-            </w:r>
-            <w:r>
-              <w:rPr>
-                <w:rFonts w:ascii="Arial" w:eastAsia="Arial" w:hAnsi="Arial" w:cs="Arial"/>
-                <w:b/>
-                <w:color w:val="525252" w:themeColor="accent3" w:themeShade="80"/>
-                <w:sz w:val="16"/>
-                <w:szCs w:val="16"/>
-              </w:rPr>
-              <w:t xml:space="preserve"> </w:t>
-            </w:r>
-            <w:r>
-              <w:rPr>
-                <w:rFonts w:ascii="Arial" w:eastAsia="Arial" w:hAnsi="Arial" w:cs="Arial"/>
-                <w:color w:val="525252" w:themeColor="accent3" w:themeShade="80"/>
-                <w:sz w:val="20"/>
-                <w:szCs w:val="20"/>
-              </w:rPr>
-              <w:t>as hipóteses devem ser construídas após a teorização e estudo do problema observado. Relacionar hipóteses de intervenção para solução do problema de estudo e selecionar a mais adequada. É importante considerar intervenções tecnicamente exequíveis, sustentáveis e economicamente viáveis</w:t>
-            </w:r>
-            <w:r>
-              <w:rPr>
-                <w:rFonts w:ascii="Arial" w:eastAsia="Arial" w:hAnsi="Arial" w:cs="Arial"/>
-                <w:b/>
-                <w:color w:val="525252" w:themeColor="accent3" w:themeShade="80"/>
-                <w:sz w:val="16"/>
-                <w:szCs w:val="16"/>
-              </w:rPr>
-              <w:t>.</w:t>
-            </w:r>
           </w:p>
         </w:tc>
       </w:tr>
@@ -1918,31 +2353,122 @@
             <w:r>
               <w:rPr>
                 <w:rFonts w:ascii="Arial" w:eastAsia="Arial" w:hAnsi="Arial" w:cs="Arial"/>
-                <w:color w:val="525252" w:themeColor="accent3" w:themeShade="80"/>
-                <w:sz w:val="20"/>
-                <w:szCs w:val="20"/>
-              </w:rPr>
-              <w:t>Inserir os dados neste espaço. Orientações:</w:t>
+                <w:color w:val="000000"/>
+                <w:sz w:val="20"/>
+                <w:szCs w:val="20"/>
+              </w:rPr>
+              <w:t>O projeto consiste no desenvolvimento do </w:t>
             </w:r>
             <w:r>
               <w:rPr>
                 <w:rFonts w:ascii="Arial" w:eastAsia="Arial" w:hAnsi="Arial" w:cs="Arial"/>
                 <w:b/>
-                <w:color w:val="525252" w:themeColor="accent3" w:themeShade="80"/>
-                <w:sz w:val="16"/>
-                <w:szCs w:val="16"/>
-              </w:rPr>
-              <w:t xml:space="preserve"> </w:t>
-            </w:r>
-            <w:r>
-              <w:rPr>
-                <w:rFonts w:ascii="Arial" w:eastAsia="Arial" w:hAnsi="Arial" w:cs="Arial"/>
-                <w:color w:val="525252" w:themeColor="accent3" w:themeShade="80"/>
-                <w:sz w:val="20"/>
-                <w:szCs w:val="20"/>
-              </w:rPr>
-              <w:t xml:space="preserve">texto sem parágrafos. Trata-se de um resumo, apresentado de forma sintética, clara, objetiva e concisa, dos pontos mais importantes da proposta do projeto: breve descrição do estudo, o problema a ser focado, público-alvo ou comunidade que será envolvido na ação extensionista, o objetivo geral da ação extensionista, as metodologias a serem utilizadas, as atividades previstas, os resultados esperados, e outras informações que forem consideradas relevantes. Escrever um texto curto. </w:t>
-            </w:r>
+                <w:bCs/>
+                <w:color w:val="000000"/>
+                <w:sz w:val="20"/>
+                <w:szCs w:val="20"/>
+              </w:rPr>
+              <w:t>Maya System</w:t>
+            </w:r>
+            <w:r>
+              <w:rPr>
+                <w:rFonts w:ascii="Arial" w:eastAsia="Arial" w:hAnsi="Arial" w:cs="Arial"/>
+                <w:color w:val="000000"/>
+                <w:sz w:val="20"/>
+                <w:szCs w:val="20"/>
+              </w:rPr>
+              <w:t>, um sistema full-</w:t>
+            </w:r>
+            <w:proofErr w:type="spellStart"/>
+            <w:r>
+              <w:rPr>
+                <w:rFonts w:ascii="Arial" w:eastAsia="Arial" w:hAnsi="Arial" w:cs="Arial"/>
+                <w:color w:val="000000"/>
+                <w:sz w:val="20"/>
+                <w:szCs w:val="20"/>
+              </w:rPr>
+              <w:t>stack</w:t>
+            </w:r>
+            <w:proofErr w:type="spellEnd"/>
+            <w:r>
+              <w:rPr>
+                <w:rFonts w:ascii="Arial" w:eastAsia="Arial" w:hAnsi="Arial" w:cs="Arial"/>
+                <w:color w:val="000000"/>
+                <w:sz w:val="20"/>
+                <w:szCs w:val="20"/>
+              </w:rPr>
+              <w:t xml:space="preserve"> voltado para a automação de uma clínica de fisioterapia. O problema focado é a ineficiência causada por processos manuais e repetitivos na gestão de pacientes e exercícios</w:t>
+            </w:r>
+            <w:r>
+              <w:rPr>
+                <w:rFonts w:ascii="Arial" w:eastAsia="Arial" w:hAnsi="Arial" w:cs="Arial"/>
+                <w:color w:val="000000"/>
+                <w:sz w:val="20"/>
+                <w:szCs w:val="20"/>
+              </w:rPr>
+              <w:t xml:space="preserve">. </w:t>
+            </w:r>
+            <w:r>
+              <w:rPr>
+                <w:rFonts w:ascii="Arial" w:eastAsia="Arial" w:hAnsi="Arial" w:cs="Arial"/>
+                <w:color w:val="000000"/>
+                <w:sz w:val="20"/>
+                <w:szCs w:val="20"/>
+              </w:rPr>
+              <w:t xml:space="preserve"> A metodologia envolve o uso de Java com Spring Boot para o </w:t>
+            </w:r>
+            <w:proofErr w:type="spellStart"/>
+            <w:r>
+              <w:rPr>
+                <w:rFonts w:ascii="Arial" w:eastAsia="Arial" w:hAnsi="Arial" w:cs="Arial"/>
+                <w:color w:val="000000"/>
+                <w:sz w:val="20"/>
+                <w:szCs w:val="20"/>
+              </w:rPr>
+              <w:t>back-end</w:t>
+            </w:r>
+            <w:proofErr w:type="spellEnd"/>
+            <w:r>
+              <w:rPr>
+                <w:rFonts w:ascii="Arial" w:eastAsia="Arial" w:hAnsi="Arial" w:cs="Arial"/>
+                <w:color w:val="000000"/>
+                <w:sz w:val="20"/>
+                <w:szCs w:val="20"/>
+              </w:rPr>
+              <w:t xml:space="preserve">, </w:t>
+            </w:r>
+            <w:proofErr w:type="spellStart"/>
+            <w:r>
+              <w:rPr>
+                <w:rFonts w:ascii="Arial" w:eastAsia="Arial" w:hAnsi="Arial" w:cs="Arial"/>
+                <w:color w:val="000000"/>
+                <w:sz w:val="20"/>
+                <w:szCs w:val="20"/>
+              </w:rPr>
+              <w:t>React</w:t>
+            </w:r>
+            <w:proofErr w:type="spellEnd"/>
+            <w:r>
+              <w:rPr>
+                <w:rFonts w:ascii="Arial" w:eastAsia="Arial" w:hAnsi="Arial" w:cs="Arial"/>
+                <w:color w:val="000000"/>
+                <w:sz w:val="20"/>
+                <w:szCs w:val="20"/>
+              </w:rPr>
+              <w:t xml:space="preserve"> para a interface web e Android Studio para a aplicação mobile. Espera-se que a intervenção elimine o retrabalho manual, organize o histórico clínico de forma digital e profissionalize a entrega de exercícios aos pacientes.</w:t>
+            </w:r>
+          </w:p>
+          <w:p>
+            <w:pPr>
+              <w:spacing w:after="0" w:line="240" w:lineRule="auto"/>
+              <w:jc w:val="both"/>
+              <w:rPr>
+                <w:rFonts w:ascii="Arial" w:eastAsia="Arial" w:hAnsi="Arial" w:cs="Arial"/>
+                <w:color w:val="000000"/>
+                <w:sz w:val="20"/>
+                <w:szCs w:val="20"/>
+              </w:rPr>
+            </w:pPr>
           </w:p>
         </w:tc>
       </w:tr>
@@ -2013,59 +2539,41 @@
             <w:r>
               <w:rPr>
                 <w:rFonts w:ascii="Arial" w:eastAsia="Arial" w:hAnsi="Arial" w:cs="Arial"/>
-                <w:color w:val="525252" w:themeColor="accent3" w:themeShade="80"/>
-                <w:sz w:val="20"/>
-                <w:szCs w:val="20"/>
-              </w:rPr>
-              <w:t>Inserir os dados neste espaço. Orientações:</w:t>
-            </w:r>
-            <w:r>
-              <w:rPr>
-                <w:rFonts w:ascii="Arial" w:eastAsia="Arial" w:hAnsi="Arial" w:cs="Arial"/>
-                <w:b/>
-                <w:color w:val="525252" w:themeColor="accent3" w:themeShade="80"/>
-                <w:sz w:val="16"/>
-                <w:szCs w:val="16"/>
-              </w:rPr>
-              <w:t xml:space="preserve"> </w:t>
-            </w:r>
-            <w:r>
-              <w:rPr>
-                <w:rFonts w:ascii="Arial" w:eastAsia="Arial" w:hAnsi="Arial" w:cs="Arial"/>
-                <w:color w:val="525252" w:themeColor="accent3" w:themeShade="80"/>
-                <w:sz w:val="20"/>
-                <w:szCs w:val="20"/>
-              </w:rPr>
-              <w:t xml:space="preserve">apresentar a introdução com base na fundamentação teórica sobre o tema trabalhado e que situe o objeto da intervenção, afirmando sua relevância. </w:t>
-            </w:r>
-            <w:r>
-              <w:rPr>
-                <w:rFonts w:ascii="Arial" w:eastAsia="Arial" w:hAnsi="Arial" w:cs="Arial"/>
-                <w:color w:val="525252" w:themeColor="accent3" w:themeShade="80"/>
                 <w:sz w:val="20"/>
                 <w:szCs w:val="20"/>
               </w:rPr>
               <w:lastRenderedPageBreak/>
-              <w:t>Descrever as áreas e ODS impactados, incluir o referencial teórico, usar referências segundo ABNT. Não se trata de uma monografia e sim de uma atividade de extensão, por isso a introdução deve ser clara, objetiva</w:t>
-            </w:r>
-            <w:r>
-              <w:rPr>
-                <w:rFonts w:ascii="Arial" w:eastAsia="Arial" w:hAnsi="Arial" w:cs="Arial"/>
-                <w:color w:val="525252" w:themeColor="accent3" w:themeShade="80"/>
-                <w:sz w:val="20"/>
-                <w:szCs w:val="20"/>
-              </w:rPr>
-              <w:t xml:space="preserve"> </w:t>
-            </w:r>
-            <w:r>
-              <w:rPr>
-                <w:rFonts w:ascii="Arial" w:eastAsia="Arial" w:hAnsi="Arial" w:cs="Arial"/>
-                <w:color w:val="525252" w:themeColor="accent3" w:themeShade="80"/>
-                <w:sz w:val="20"/>
-                <w:szCs w:val="20"/>
-              </w:rPr>
-              <w:t xml:space="preserve">e sintética. </w:t>
-            </w:r>
+              <w:t>A fisioterapia, especialmente em técnicas como o RPG, exige um acompanhamento rigoroso da evolução postural do paciente. Contudo, a dependência de registros manuais gera ineficiência e riscos à integridade dos dados. Este projeto utiliza tecnologias modernas de desenvolvimento full-</w:t>
+            </w:r>
+            <w:proofErr w:type="spellStart"/>
+            <w:r>
+              <w:rPr>
+                <w:rFonts w:ascii="Arial" w:eastAsia="Arial" w:hAnsi="Arial" w:cs="Arial"/>
+                <w:sz w:val="20"/>
+                <w:szCs w:val="20"/>
+              </w:rPr>
+              <w:t>stack</w:t>
+            </w:r>
+            <w:proofErr w:type="spellEnd"/>
+            <w:r>
+              <w:rPr>
+                <w:rFonts w:ascii="Arial" w:eastAsia="Arial" w:hAnsi="Arial" w:cs="Arial"/>
+                <w:sz w:val="20"/>
+                <w:szCs w:val="20"/>
+              </w:rPr>
+              <w:t xml:space="preserve"> e infraestrutura AWS para propor uma solução digital que alinhe a prática clínica às exigências tecnológicas atuais.</w:t>
+            </w:r>
+          </w:p>
+          <w:p>
+            <w:pPr>
+              <w:spacing w:after="0" w:line="240" w:lineRule="auto"/>
+              <w:jc w:val="both"/>
+              <w:rPr>
+                <w:rFonts w:ascii="Arial" w:eastAsia="Arial" w:hAnsi="Arial" w:cs="Arial"/>
+                <w:sz w:val="20"/>
+                <w:szCs w:val="20"/>
+              </w:rPr>
+            </w:pPr>
           </w:p>
         </w:tc>
       </w:tr>
@@ -2124,6 +2632,10 @@
           </w:tcPr>
           <w:p>
             <w:pPr>
+              <w:numPr>
+                <w:ilvl w:val="0"/>
+                <w:numId w:val="2"/>
+              </w:numPr>
               <w:tabs>
                 <w:tab w:val="left" w:pos="360"/>
               </w:tabs>
@@ -2131,39 +2643,119 @@
               <w:jc w:val="both"/>
               <w:rPr>
                 <w:rFonts w:ascii="Arial" w:eastAsia="Arial" w:hAnsi="Arial" w:cs="Arial"/>
+                <w:color w:val="525252" w:themeColor="accent3" w:themeShade="80"/>
+                <w:sz w:val="20"/>
+                <w:szCs w:val="20"/>
+              </w:rPr>
+            </w:pPr>
+            <w:r>
+              <w:rPr>
+                <w:rFonts w:ascii="Arial" w:eastAsia="Arial" w:hAnsi="Arial" w:cs="Arial"/>
+                <w:color w:val="525252" w:themeColor="accent3" w:themeShade="80"/>
+                <w:sz w:val="20"/>
+                <w:szCs w:val="20"/>
+              </w:rPr>
+              <w:t>Desenvolver uma plataforma web para gestão administrativa e clínica.</w:t>
+            </w:r>
+          </w:p>
+          <w:p>
+            <w:pPr>
+              <w:numPr>
+                <w:ilvl w:val="0"/>
+                <w:numId w:val="2"/>
+              </w:numPr>
+              <w:tabs>
+                <w:tab w:val="left" w:pos="360"/>
+              </w:tabs>
+              <w:spacing w:after="0" w:line="240" w:lineRule="auto"/>
+              <w:jc w:val="both"/>
+              <w:rPr>
+                <w:rFonts w:ascii="Arial" w:eastAsia="Arial" w:hAnsi="Arial" w:cs="Arial"/>
+                <w:color w:val="525252" w:themeColor="accent3" w:themeShade="80"/>
+                <w:sz w:val="20"/>
+                <w:szCs w:val="20"/>
+              </w:rPr>
+            </w:pPr>
+            <w:r>
+              <w:rPr>
+                <w:rFonts w:ascii="Arial" w:eastAsia="Arial" w:hAnsi="Arial" w:cs="Arial"/>
+                <w:color w:val="525252" w:themeColor="accent3" w:themeShade="80"/>
+                <w:sz w:val="20"/>
+                <w:szCs w:val="20"/>
+              </w:rPr>
+              <w:t>Criar um aplicativo mobile para consulta e prescrição ágil de exercícios.</w:t>
+            </w:r>
+          </w:p>
+          <w:p>
+            <w:pPr>
+              <w:numPr>
+                <w:ilvl w:val="0"/>
+                <w:numId w:val="2"/>
+              </w:numPr>
+              <w:tabs>
+                <w:tab w:val="left" w:pos="360"/>
+              </w:tabs>
+              <w:spacing w:after="0" w:line="240" w:lineRule="auto"/>
+              <w:jc w:val="both"/>
+              <w:rPr>
+                <w:rFonts w:ascii="Arial" w:eastAsia="Arial" w:hAnsi="Arial" w:cs="Arial"/>
+                <w:color w:val="525252" w:themeColor="accent3" w:themeShade="80"/>
+                <w:sz w:val="20"/>
+                <w:szCs w:val="20"/>
+              </w:rPr>
+            </w:pPr>
+            <w:r>
+              <w:rPr>
+                <w:rFonts w:ascii="Arial" w:eastAsia="Arial" w:hAnsi="Arial" w:cs="Arial"/>
+                <w:color w:val="525252" w:themeColor="accent3" w:themeShade="80"/>
+                <w:sz w:val="20"/>
+                <w:szCs w:val="20"/>
+              </w:rPr>
+              <w:t>Implementar um banco de dados seguro para armazenamento de registros de RPG.</w:t>
+            </w:r>
+          </w:p>
+          <w:p>
+            <w:pPr>
+              <w:numPr>
+                <w:ilvl w:val="0"/>
+                <w:numId w:val="2"/>
+              </w:numPr>
+              <w:tabs>
+                <w:tab w:val="left" w:pos="360"/>
+              </w:tabs>
+              <w:spacing w:after="0" w:line="240" w:lineRule="auto"/>
+              <w:jc w:val="both"/>
+              <w:rPr>
+                <w:rFonts w:ascii="Arial" w:eastAsia="Arial" w:hAnsi="Arial" w:cs="Arial"/>
+                <w:color w:val="525252" w:themeColor="accent3" w:themeShade="80"/>
+                <w:sz w:val="20"/>
+                <w:szCs w:val="20"/>
+              </w:rPr>
+            </w:pPr>
+            <w:r>
+              <w:rPr>
+                <w:rFonts w:ascii="Arial" w:eastAsia="Arial" w:hAnsi="Arial" w:cs="Arial"/>
+                <w:color w:val="525252" w:themeColor="accent3" w:themeShade="80"/>
+                <w:sz w:val="20"/>
+                <w:szCs w:val="20"/>
+              </w:rPr>
+              <w:t>Automatizar tarefas repetitivas do cotidiano clínico para otimizar o tempo de atendimento.</w:t>
+            </w:r>
+          </w:p>
+          <w:p>
+            <w:pPr>
+              <w:tabs>
+                <w:tab w:val="left" w:pos="360"/>
+              </w:tabs>
+              <w:spacing w:after="0" w:line="240" w:lineRule="auto"/>
+              <w:jc w:val="both"/>
+              <w:rPr>
+                <w:rFonts w:ascii="Arial" w:eastAsia="Arial" w:hAnsi="Arial" w:cs="Arial"/>
                 <w:color w:val="FF3333"/>
                 <w:sz w:val="20"/>
                 <w:szCs w:val="20"/>
               </w:rPr>
             </w:pPr>
-            <w:r>
-              <w:rPr>
-                <w:rFonts w:ascii="Arial" w:eastAsia="Arial" w:hAnsi="Arial" w:cs="Arial"/>
-                <w:color w:val="525252" w:themeColor="accent3" w:themeShade="80"/>
-                <w:sz w:val="20"/>
-                <w:szCs w:val="20"/>
-              </w:rPr>
-              <w:t>Inserir os dados neste espaço. Orientações:</w:t>
-            </w:r>
-            <w:r>
-              <w:rPr>
-                <w:rFonts w:ascii="Arial" w:eastAsia="Arial" w:hAnsi="Arial" w:cs="Arial"/>
-                <w:b/>
-                <w:color w:val="525252" w:themeColor="accent3" w:themeShade="80"/>
-                <w:sz w:val="16"/>
-                <w:szCs w:val="16"/>
-              </w:rPr>
-              <w:t xml:space="preserve"> </w:t>
-            </w:r>
-            <w:r>
-              <w:rPr>
-                <w:rFonts w:ascii="Arial" w:eastAsia="Arial" w:hAnsi="Arial" w:cs="Arial"/>
-                <w:color w:val="525252" w:themeColor="accent3" w:themeShade="80"/>
-                <w:sz w:val="20"/>
-                <w:szCs w:val="20"/>
-              </w:rPr>
-              <w:t>Descrever os objetivos de forma clara. Cada objetivo deve ter uma correspondência com os resultados esperados. Devem ser expressos sucintamente, em itens, iniciando a frase com verbo de ação e não em forma de relatos.</w:t>
-            </w:r>
           </w:p>
         </w:tc>
       </w:tr>
@@ -2224,29 +2816,21 @@
               <w:jc w:val="both"/>
               <w:rPr>
                 <w:rFonts w:ascii="Arial" w:eastAsia="Arial" w:hAnsi="Arial" w:cs="Arial"/>
-                <w:sz w:val="20"/>
-                <w:szCs w:val="20"/>
-              </w:rPr>
-            </w:pPr>
-            <w:r>
-              <w:rPr>
-                <w:rFonts w:ascii="Arial" w:eastAsia="Arial" w:hAnsi="Arial" w:cs="Arial"/>
                 <w:color w:val="525252" w:themeColor="accent3" w:themeShade="80"/>
                 <w:sz w:val="20"/>
                 <w:szCs w:val="20"/>
               </w:rPr>
-              <w:t>Inserir os dados neste espaço. Orientações:</w:t>
-            </w:r>
-            <w:r>
-              <w:rPr>
-                <w:rFonts w:ascii="Arial" w:eastAsia="Arial" w:hAnsi="Arial" w:cs="Arial"/>
-                <w:b/>
+            </w:pPr>
+            <w:r>
+              <w:rPr>
+                <w:rFonts w:ascii="Arial" w:eastAsia="Arial" w:hAnsi="Arial" w:cs="Arial"/>
                 <w:color w:val="525252" w:themeColor="accent3" w:themeShade="80"/>
-                <w:sz w:val="16"/>
-                <w:szCs w:val="16"/>
-              </w:rPr>
-              <w:t xml:space="preserve"> </w:t>
-            </w:r>
+                <w:sz w:val="20"/>
+                <w:szCs w:val="20"/>
+              </w:rPr>
+              <w:t xml:space="preserve">A ação extensionista será realizada através do levantamento de requisitos diretamente com a profissional responsável, seguido pelo desenvolvimento iterativo do software. Serão utilizadas ferramentas como Spring Boot para o </w:t>
+            </w:r>
+            <w:proofErr w:type="spellStart"/>
             <w:r>
               <w:rPr>
                 <w:rFonts w:ascii="Arial" w:eastAsia="Arial" w:hAnsi="Arial" w:cs="Arial"/>
@@ -2254,8 +2838,49 @@
                 <w:sz w:val="20"/>
                 <w:szCs w:val="20"/>
               </w:rPr>
-              <w:t xml:space="preserve">descrever como ocorrerá a ação extensionista junto ao público-alvo. Trata-se descrição sobre como será realizada a prática da ação extensionista, é o detalhamento do caminho a ser percorrido pela equipe em sua interação com a sociedade. Descrever os métodos, técnicas e estratégias para a implementação das atividades de intervenção previstas no projeto e sua contribuição para o alcance dos objetivos. Descrever o local, público-alvo, ferramentas empregadas para a relação dialógica com a comunidade ou setores da sociedade: visitas, entrevistas, questionários, reuniões, roda de conversa, ou uso de outras ferramentas de levantamento. Detalhar os procedimentos e as atividades a serem implementadas. </w:t>
-            </w:r>
+              <w:t>back-end</w:t>
+            </w:r>
+            <w:proofErr w:type="spellEnd"/>
+            <w:r>
+              <w:rPr>
+                <w:rFonts w:ascii="Arial" w:eastAsia="Arial" w:hAnsi="Arial" w:cs="Arial"/>
+                <w:color w:val="525252" w:themeColor="accent3" w:themeShade="80"/>
+                <w:sz w:val="20"/>
+                <w:szCs w:val="20"/>
+              </w:rPr>
+              <w:t xml:space="preserve">, </w:t>
+            </w:r>
+            <w:proofErr w:type="spellStart"/>
+            <w:r>
+              <w:rPr>
+                <w:rFonts w:ascii="Arial" w:eastAsia="Arial" w:hAnsi="Arial" w:cs="Arial"/>
+                <w:color w:val="525252" w:themeColor="accent3" w:themeShade="80"/>
+                <w:sz w:val="20"/>
+                <w:szCs w:val="20"/>
+              </w:rPr>
+              <w:t>React</w:t>
+            </w:r>
+            <w:proofErr w:type="spellEnd"/>
+            <w:r>
+              <w:rPr>
+                <w:rFonts w:ascii="Arial" w:eastAsia="Arial" w:hAnsi="Arial" w:cs="Arial"/>
+                <w:color w:val="525252" w:themeColor="accent3" w:themeShade="80"/>
+                <w:sz w:val="20"/>
+                <w:szCs w:val="20"/>
+              </w:rPr>
+              <w:t xml:space="preserve"> para o painel administrativo web e Android Studio para a interface de consulta rápida, garantindo uma relação dialógica entre a necessidade da clínica e a solução técnica proposta.</w:t>
+            </w:r>
+          </w:p>
+          <w:p>
+            <w:pPr>
+              <w:spacing w:after="0" w:line="240" w:lineRule="auto"/>
+              <w:jc w:val="both"/>
+              <w:rPr>
+                <w:rFonts w:ascii="Arial" w:eastAsia="Arial" w:hAnsi="Arial" w:cs="Arial"/>
+                <w:sz w:val="20"/>
+                <w:szCs w:val="20"/>
+              </w:rPr>
+            </w:pPr>
           </w:p>
         </w:tc>
       </w:tr>
@@ -2324,12 +2949,30 @@
             <w:r>
               <w:rPr>
                 <w:rFonts w:ascii="Arial" w:eastAsia="Arial" w:hAnsi="Arial" w:cs="Arial"/>
-                <w:color w:val="525252" w:themeColor="accent3" w:themeShade="80"/>
-                <w:sz w:val="20"/>
-                <w:szCs w:val="20"/>
-              </w:rPr>
-              <w:t xml:space="preserve">Inserir os dados neste espaço. Orientações: este item pode ser apresentado como resultados parciais, ou resultados finais para projetos implementados, ou, ainda, resultados esperados para propostas de projetos. Descrever de forma objetiva de que modo o projeto espera modificar as condições inicialmente diagnosticadas no público-alvo envolvido. Trata-se de uma projeção dos impactos sociais esperados ou desejados, considerando que a extensão universitária busca estar atenta aos interesses e necessidades da maioria da população, buscando superar desigualdades, garantir diversidade, evitar exclusões, implementar o desenvolvimento regional e desenvolver políticas públicas. </w:t>
-            </w:r>
+                <w:sz w:val="20"/>
+                <w:szCs w:val="20"/>
+              </w:rPr>
+              <w:t>Os objetivos foram atingidos com a entrega de um sistema funcional que serve como base para futuras expansões, como a inclusão de análise de dados de evolução do paciente.</w:t>
+            </w:r>
+            <w:r>
+              <w:rPr>
+                <w:rFonts w:ascii="Arial" w:eastAsia="Arial" w:hAnsi="Arial" w:cs="Arial"/>
+                <w:sz w:val="20"/>
+                <w:szCs w:val="20"/>
+              </w:rPr>
+              <w:t xml:space="preserve"> Nele atualmente ela consegue cadastrar pacientes, gerar acesso para o app, adicionar sessões, exercícios e acompanhar a evolução de cada um.</w:t>
+            </w:r>
+          </w:p>
+          <w:p>
+            <w:pPr>
+              <w:spacing w:after="0" w:line="240" w:lineRule="auto"/>
+              <w:jc w:val="both"/>
+              <w:rPr>
+                <w:rFonts w:ascii="Arial" w:eastAsia="Arial" w:hAnsi="Arial" w:cs="Arial"/>
+                <w:sz w:val="20"/>
+                <w:szCs w:val="20"/>
+              </w:rPr>
+            </w:pPr>
           </w:p>
         </w:tc>
       </w:tr>
@@ -2402,30 +3045,26 @@
             <w:r>
               <w:rPr>
                 <w:rFonts w:ascii="Arial" w:eastAsia="Arial" w:hAnsi="Arial" w:cs="Arial"/>
-                <w:color w:val="525252" w:themeColor="accent3" w:themeShade="80"/>
-                <w:sz w:val="20"/>
-                <w:szCs w:val="20"/>
-              </w:rPr>
-              <w:t>Inserir os dados neste espaço. Orientações:</w:t>
-            </w:r>
-            <w:r>
-              <w:rPr>
-                <w:rFonts w:ascii="Arial" w:eastAsia="Arial" w:hAnsi="Arial" w:cs="Arial"/>
-                <w:b/>
-                <w:color w:val="525252" w:themeColor="accent3" w:themeShade="80"/>
-                <w:sz w:val="16"/>
-                <w:szCs w:val="16"/>
-              </w:rPr>
-              <w:t xml:space="preserve"> </w:t>
-            </w:r>
-            <w:r>
-              <w:rPr>
-                <w:rFonts w:ascii="Arial" w:eastAsia="Arial" w:hAnsi="Arial" w:cs="Arial"/>
-                <w:color w:val="525252" w:themeColor="accent3" w:themeShade="80"/>
-                <w:sz w:val="20"/>
-                <w:szCs w:val="20"/>
-              </w:rPr>
-              <w:t>é o desfecho do projeto devendo responder o problema central do trabalho e destacar se o trabalho atendeu aos objetivos propostos, destacando os principais pontos e direções para futuras ações.</w:t>
+                <w:sz w:val="20"/>
+                <w:szCs w:val="20"/>
+              </w:rPr>
+              <w:t>O projeto responde ao problema central ao eliminar o fluxo de trabalho manual e repetitivo, proporcionando uma gestão clínica organizada e segura.</w:t>
+            </w:r>
+            <w:r>
+              <w:rPr>
+                <w:rFonts w:ascii="Arial" w:eastAsia="Arial" w:hAnsi="Arial" w:cs="Arial"/>
+                <w:sz w:val="20"/>
+                <w:szCs w:val="20"/>
+              </w:rPr>
+              <w:t xml:space="preserve"> U</w:t>
+            </w:r>
+            <w:r>
+              <w:rPr>
+                <w:rFonts w:ascii="Arial" w:eastAsia="Arial" w:hAnsi="Arial" w:cs="Arial"/>
+                <w:sz w:val="20"/>
+                <w:szCs w:val="20"/>
+              </w:rPr>
+              <w:t>m sistema funcional que serve como base para futuras expansões, como a inclusão de análise de dados de evolução do paciente.</w:t>
             </w:r>
           </w:p>
         </w:tc>
@@ -2714,6 +3353,7 @@
                 <w:sz w:val="20"/>
                 <w:szCs w:val="20"/>
               </w:rPr>
+              <w:lastRenderedPageBreak/>
               <w:t>Fontes:</w:t>
             </w:r>
           </w:p>
@@ -2793,7 +3433,6 @@
                 <w:sz w:val="20"/>
                 <w:szCs w:val="20"/>
               </w:rPr>
-              <w:lastRenderedPageBreak/>
               <w:t>Documentos FECAP</w:t>
             </w:r>
           </w:p>
@@ -2878,16 +3517,522 @@
           <w:sz w:val="20"/>
           <w:szCs w:val="20"/>
         </w:rPr>
-        <w:t>Versão 2.0 – 10/2024</w:t>
-      </w:r>
+        <w:t xml:space="preserve">Versão 2.0 – </w:t>
+      </w:r>
+      <w:r>
+        <w:rPr>
+          <w:rFonts w:ascii="Arial" w:hAnsi="Arial" w:cs="Arial"/>
+          <w:sz w:val="20"/>
+          <w:szCs w:val="20"/>
+        </w:rPr>
+        <w:t>02</w:t>
+      </w:r>
+      <w:r>
+        <w:rPr>
+          <w:rFonts w:ascii="Arial" w:hAnsi="Arial" w:cs="Arial"/>
+          <w:sz w:val="20"/>
+          <w:szCs w:val="20"/>
+        </w:rPr>
+        <w:t>/202</w:t>
+      </w:r>
+      <w:r>
+        <w:rPr>
+          <w:rFonts w:ascii="Arial" w:hAnsi="Arial" w:cs="Arial"/>
+          <w:sz w:val="20"/>
+          <w:szCs w:val="20"/>
+        </w:rPr>
+        <w:t>6</w:t>
+      </w:r>
+    </w:p>
+    <w:p>
+      <w:pPr>
+        <w:ind w:left="-851"/>
+        <w:rPr>
+          <w:rFonts w:ascii="Arial" w:hAnsi="Arial" w:cs="Arial"/>
+          <w:sz w:val="20"/>
+          <w:szCs w:val="20"/>
+        </w:rPr>
+      </w:pPr>
+      <w:r>
+        <w:rPr>
+          <w:rFonts w:ascii="Arial" w:hAnsi="Arial" w:cs="Arial"/>
+          <w:sz w:val="20"/>
+          <w:szCs w:val="20"/>
+        </w:rPr>
+        <w:t>Versão 2.</w:t>
+      </w:r>
+      <w:r>
+        <w:rPr>
+          <w:rFonts w:ascii="Arial" w:hAnsi="Arial" w:cs="Arial"/>
+          <w:sz w:val="20"/>
+          <w:szCs w:val="20"/>
+        </w:rPr>
+        <w:t xml:space="preserve">1 </w:t>
+      </w:r>
+      <w:r>
+        <w:rPr>
+          <w:rFonts w:ascii="Arial" w:hAnsi="Arial" w:cs="Arial"/>
+          <w:sz w:val="20"/>
+          <w:szCs w:val="20"/>
+        </w:rPr>
+        <w:t>–</w:t>
+      </w:r>
+      <w:r>
+        <w:rPr>
+          <w:rFonts w:ascii="Arial" w:hAnsi="Arial" w:cs="Arial"/>
+          <w:sz w:val="20"/>
+          <w:szCs w:val="20"/>
+        </w:rPr>
+        <w:t xml:space="preserve"> estruturando projeto</w:t>
+      </w:r>
+      <w:r>
+        <w:rPr>
+          <w:rFonts w:ascii="Arial" w:hAnsi="Arial" w:cs="Arial"/>
+          <w:sz w:val="20"/>
+          <w:szCs w:val="20"/>
+        </w:rPr>
+        <w:t xml:space="preserve"> – </w:t>
+      </w:r>
+      <w:r>
+        <w:rPr>
+          <w:rFonts w:ascii="Arial" w:hAnsi="Arial" w:cs="Arial"/>
+          <w:sz w:val="20"/>
+          <w:szCs w:val="20"/>
+        </w:rPr>
+        <w:t>02</w:t>
+      </w:r>
+      <w:r>
+        <w:rPr>
+          <w:rFonts w:ascii="Arial" w:hAnsi="Arial" w:cs="Arial"/>
+          <w:sz w:val="20"/>
+          <w:szCs w:val="20"/>
+        </w:rPr>
+        <w:t>/202</w:t>
+      </w:r>
+      <w:r>
+        <w:rPr>
+          <w:rFonts w:ascii="Arial" w:hAnsi="Arial" w:cs="Arial"/>
+          <w:sz w:val="20"/>
+          <w:szCs w:val="20"/>
+        </w:rPr>
+        <w:t>6</w:t>
+      </w:r>
+    </w:p>
+    <w:p>
+      <w:pPr>
+        <w:ind w:left="-851"/>
+        <w:rPr>
+          <w:rFonts w:ascii="Arial" w:hAnsi="Arial" w:cs="Arial"/>
+          <w:sz w:val="20"/>
+          <w:szCs w:val="20"/>
+        </w:rPr>
+      </w:pPr>
+      <w:r>
+        <w:rPr>
+          <w:rFonts w:ascii="Arial" w:hAnsi="Arial" w:cs="Arial"/>
+          <w:sz w:val="20"/>
+          <w:szCs w:val="20"/>
+        </w:rPr>
+        <w:t>Versão 2.</w:t>
+      </w:r>
+      <w:r>
+        <w:rPr>
+          <w:rFonts w:ascii="Arial" w:hAnsi="Arial" w:cs="Arial"/>
+          <w:sz w:val="20"/>
+          <w:szCs w:val="20"/>
+        </w:rPr>
+        <w:t>2</w:t>
+      </w:r>
+      <w:r>
+        <w:rPr>
+          <w:rFonts w:ascii="Arial" w:hAnsi="Arial" w:cs="Arial"/>
+          <w:sz w:val="20"/>
+          <w:szCs w:val="20"/>
+        </w:rPr>
+        <w:t xml:space="preserve"> –</w:t>
+      </w:r>
+      <w:r>
+        <w:rPr>
+          <w:rFonts w:ascii="Arial" w:hAnsi="Arial" w:cs="Arial"/>
+          <w:sz w:val="20"/>
+          <w:szCs w:val="20"/>
+        </w:rPr>
+        <w:t xml:space="preserve"> estruturando banco de dados </w:t>
+      </w:r>
+      <w:r>
+        <w:rPr>
+          <w:rFonts w:ascii="Arial" w:hAnsi="Arial" w:cs="Arial"/>
+          <w:sz w:val="20"/>
+          <w:szCs w:val="20"/>
+        </w:rPr>
+        <w:t xml:space="preserve">– </w:t>
+      </w:r>
+      <w:r>
+        <w:rPr>
+          <w:rFonts w:ascii="Arial" w:hAnsi="Arial" w:cs="Arial"/>
+          <w:sz w:val="20"/>
+          <w:szCs w:val="20"/>
+        </w:rPr>
+        <w:t>02</w:t>
+      </w:r>
+      <w:r>
+        <w:rPr>
+          <w:rFonts w:ascii="Arial" w:hAnsi="Arial" w:cs="Arial"/>
+          <w:sz w:val="20"/>
+          <w:szCs w:val="20"/>
+        </w:rPr>
+        <w:t>/202</w:t>
+      </w:r>
+      <w:r>
+        <w:rPr>
+          <w:rFonts w:ascii="Arial" w:hAnsi="Arial" w:cs="Arial"/>
+          <w:sz w:val="20"/>
+          <w:szCs w:val="20"/>
+        </w:rPr>
+        <w:t>6</w:t>
+      </w:r>
+    </w:p>
+    <w:p>
+      <w:pPr>
+        <w:ind w:left="-851"/>
+        <w:rPr>
+          <w:rFonts w:ascii="Arial" w:hAnsi="Arial" w:cs="Arial"/>
+          <w:sz w:val="20"/>
+          <w:szCs w:val="20"/>
+        </w:rPr>
+      </w:pPr>
+      <w:r>
+        <w:rPr>
+          <w:rFonts w:ascii="Arial" w:hAnsi="Arial" w:cs="Arial"/>
+          <w:sz w:val="20"/>
+          <w:szCs w:val="20"/>
+        </w:rPr>
+        <w:t>Versão 2.</w:t>
+      </w:r>
+      <w:r>
+        <w:rPr>
+          <w:rFonts w:ascii="Arial" w:hAnsi="Arial" w:cs="Arial"/>
+          <w:sz w:val="20"/>
+          <w:szCs w:val="20"/>
+        </w:rPr>
+        <w:t xml:space="preserve">3 </w:t>
+      </w:r>
+      <w:r>
+        <w:rPr>
+          <w:rFonts w:ascii="Arial" w:hAnsi="Arial" w:cs="Arial"/>
+          <w:sz w:val="20"/>
+          <w:szCs w:val="20"/>
+        </w:rPr>
+        <w:t>–</w:t>
+      </w:r>
+      <w:r>
+        <w:rPr>
+          <w:rFonts w:ascii="Arial" w:hAnsi="Arial" w:cs="Arial"/>
+          <w:sz w:val="20"/>
+          <w:szCs w:val="20"/>
+        </w:rPr>
+        <w:t xml:space="preserve"> atualizando interface</w:t>
+      </w:r>
+      <w:r>
+        <w:rPr>
+          <w:rFonts w:ascii="Arial" w:hAnsi="Arial" w:cs="Arial"/>
+          <w:sz w:val="20"/>
+          <w:szCs w:val="20"/>
+        </w:rPr>
+        <w:t xml:space="preserve"> – </w:t>
+      </w:r>
+      <w:r>
+        <w:rPr>
+          <w:rFonts w:ascii="Arial" w:hAnsi="Arial" w:cs="Arial"/>
+          <w:sz w:val="20"/>
+          <w:szCs w:val="20"/>
+        </w:rPr>
+        <w:t>02</w:t>
+      </w:r>
+      <w:r>
+        <w:rPr>
+          <w:rFonts w:ascii="Arial" w:hAnsi="Arial" w:cs="Arial"/>
+          <w:sz w:val="20"/>
+          <w:szCs w:val="20"/>
+        </w:rPr>
+        <w:t>/202</w:t>
+      </w:r>
+      <w:r>
+        <w:rPr>
+          <w:rFonts w:ascii="Arial" w:hAnsi="Arial" w:cs="Arial"/>
+          <w:sz w:val="20"/>
+          <w:szCs w:val="20"/>
+        </w:rPr>
+        <w:t>6</w:t>
+      </w:r>
+    </w:p>
+    <w:p>
+      <w:pPr>
+        <w:ind w:left="-851"/>
+        <w:rPr>
+          <w:rFonts w:ascii="Arial" w:hAnsi="Arial" w:cs="Arial"/>
+          <w:sz w:val="20"/>
+          <w:szCs w:val="20"/>
+        </w:rPr>
+      </w:pPr>
+      <w:r>
+        <w:rPr>
+          <w:rFonts w:ascii="Arial" w:hAnsi="Arial" w:cs="Arial"/>
+          <w:sz w:val="20"/>
+          <w:szCs w:val="20"/>
+        </w:rPr>
+        <w:t>Versão 2.</w:t>
+      </w:r>
+      <w:r>
+        <w:rPr>
+          <w:rFonts w:ascii="Arial" w:hAnsi="Arial" w:cs="Arial"/>
+          <w:sz w:val="20"/>
+          <w:szCs w:val="20"/>
+        </w:rPr>
+        <w:t xml:space="preserve">4 </w:t>
+      </w:r>
+      <w:r>
+        <w:rPr>
+          <w:rFonts w:ascii="Arial" w:hAnsi="Arial" w:cs="Arial"/>
+          <w:sz w:val="20"/>
+          <w:szCs w:val="20"/>
+        </w:rPr>
+        <w:t>–</w:t>
+      </w:r>
+      <w:r>
+        <w:rPr>
+          <w:rFonts w:ascii="Arial" w:hAnsi="Arial" w:cs="Arial"/>
+          <w:sz w:val="20"/>
+          <w:szCs w:val="20"/>
+        </w:rPr>
+        <w:t xml:space="preserve"> estruturando app</w:t>
+      </w:r>
+      <w:r>
+        <w:rPr>
+          <w:rFonts w:ascii="Arial" w:hAnsi="Arial" w:cs="Arial"/>
+          <w:sz w:val="20"/>
+          <w:szCs w:val="20"/>
+        </w:rPr>
+        <w:t xml:space="preserve"> – </w:t>
+      </w:r>
+      <w:r>
+        <w:rPr>
+          <w:rFonts w:ascii="Arial" w:hAnsi="Arial" w:cs="Arial"/>
+          <w:sz w:val="20"/>
+          <w:szCs w:val="20"/>
+        </w:rPr>
+        <w:t>02</w:t>
+      </w:r>
+      <w:r>
+        <w:rPr>
+          <w:rFonts w:ascii="Arial" w:hAnsi="Arial" w:cs="Arial"/>
+          <w:sz w:val="20"/>
+          <w:szCs w:val="20"/>
+        </w:rPr>
+        <w:t>/202</w:t>
+      </w:r>
+      <w:r>
+        <w:rPr>
+          <w:rFonts w:ascii="Arial" w:hAnsi="Arial" w:cs="Arial"/>
+          <w:sz w:val="20"/>
+          <w:szCs w:val="20"/>
+        </w:rPr>
+        <w:t>6</w:t>
+      </w:r>
+    </w:p>
+    <w:p>
+      <w:pPr>
+        <w:ind w:left="-851"/>
+        <w:rPr>
+          <w:rFonts w:ascii="Arial" w:hAnsi="Arial" w:cs="Arial"/>
+          <w:sz w:val="20"/>
+          <w:szCs w:val="20"/>
+        </w:rPr>
+      </w:pPr>
+      <w:r>
+        <w:rPr>
+          <w:rFonts w:ascii="Arial" w:hAnsi="Arial" w:cs="Arial"/>
+          <w:sz w:val="20"/>
+          <w:szCs w:val="20"/>
+        </w:rPr>
+        <w:t>Versão 2.</w:t>
+      </w:r>
+      <w:r>
+        <w:rPr>
+          <w:rFonts w:ascii="Arial" w:hAnsi="Arial" w:cs="Arial"/>
+          <w:sz w:val="20"/>
+          <w:szCs w:val="20"/>
+        </w:rPr>
+        <w:t>5</w:t>
+      </w:r>
+      <w:r>
+        <w:rPr>
+          <w:rFonts w:ascii="Arial" w:hAnsi="Arial" w:cs="Arial"/>
+          <w:sz w:val="20"/>
+          <w:szCs w:val="20"/>
+        </w:rPr>
+        <w:t xml:space="preserve"> –</w:t>
+      </w:r>
+      <w:r>
+        <w:rPr>
+          <w:rFonts w:ascii="Arial" w:hAnsi="Arial" w:cs="Arial"/>
+          <w:sz w:val="20"/>
+          <w:szCs w:val="20"/>
+        </w:rPr>
+        <w:t xml:space="preserve"> linkando app e web </w:t>
+      </w:r>
+      <w:r>
+        <w:rPr>
+          <w:rFonts w:ascii="Arial" w:hAnsi="Arial" w:cs="Arial"/>
+          <w:sz w:val="20"/>
+          <w:szCs w:val="20"/>
+        </w:rPr>
+        <w:t xml:space="preserve">– </w:t>
+      </w:r>
+      <w:r>
+        <w:rPr>
+          <w:rFonts w:ascii="Arial" w:hAnsi="Arial" w:cs="Arial"/>
+          <w:sz w:val="20"/>
+          <w:szCs w:val="20"/>
+        </w:rPr>
+        <w:t>02</w:t>
+      </w:r>
+      <w:r>
+        <w:rPr>
+          <w:rFonts w:ascii="Arial" w:hAnsi="Arial" w:cs="Arial"/>
+          <w:sz w:val="20"/>
+          <w:szCs w:val="20"/>
+        </w:rPr>
+        <w:t>/202</w:t>
+      </w:r>
+      <w:r>
+        <w:rPr>
+          <w:rFonts w:ascii="Arial" w:hAnsi="Arial" w:cs="Arial"/>
+          <w:sz w:val="20"/>
+          <w:szCs w:val="20"/>
+        </w:rPr>
+        <w:t>6</w:t>
+      </w:r>
+    </w:p>
+    <w:p>
+      <w:pPr>
+        <w:ind w:left="-851"/>
+        <w:rPr>
+          <w:rFonts w:ascii="Arial" w:hAnsi="Arial" w:cs="Arial"/>
+          <w:sz w:val="20"/>
+          <w:szCs w:val="20"/>
+        </w:rPr>
+      </w:pPr>
+      <w:r>
+        <w:rPr>
+          <w:rFonts w:ascii="Arial" w:hAnsi="Arial" w:cs="Arial"/>
+          <w:sz w:val="20"/>
+          <w:szCs w:val="20"/>
+        </w:rPr>
+        <w:t>Versão 2.</w:t>
+      </w:r>
+      <w:r>
+        <w:rPr>
+          <w:rFonts w:ascii="Arial" w:hAnsi="Arial" w:cs="Arial"/>
+          <w:sz w:val="20"/>
+          <w:szCs w:val="20"/>
+        </w:rPr>
+        <w:t>5</w:t>
+      </w:r>
+      <w:r>
+        <w:rPr>
+          <w:rFonts w:ascii="Arial" w:hAnsi="Arial" w:cs="Arial"/>
+          <w:sz w:val="20"/>
+          <w:szCs w:val="20"/>
+        </w:rPr>
+        <w:t xml:space="preserve"> –</w:t>
+      </w:r>
+      <w:r>
+        <w:rPr>
+          <w:rFonts w:ascii="Arial" w:hAnsi="Arial" w:cs="Arial"/>
+          <w:sz w:val="20"/>
+          <w:szCs w:val="20"/>
+        </w:rPr>
+        <w:t xml:space="preserve"> </w:t>
+      </w:r>
+      <w:r>
+        <w:rPr>
+          <w:rFonts w:ascii="Arial" w:hAnsi="Arial" w:cs="Arial"/>
+          <w:sz w:val="20"/>
+          <w:szCs w:val="20"/>
+        </w:rPr>
+        <w:t xml:space="preserve">atualizando versão final </w:t>
+      </w:r>
+      <w:r>
+        <w:rPr>
+          <w:rFonts w:ascii="Arial" w:hAnsi="Arial" w:cs="Arial"/>
+          <w:sz w:val="20"/>
+          <w:szCs w:val="20"/>
+        </w:rPr>
+        <w:t xml:space="preserve">– </w:t>
+      </w:r>
+      <w:r>
+        <w:rPr>
+          <w:rFonts w:ascii="Arial" w:hAnsi="Arial" w:cs="Arial"/>
+          <w:sz w:val="20"/>
+          <w:szCs w:val="20"/>
+        </w:rPr>
+        <w:t>02</w:t>
+      </w:r>
+      <w:r>
+        <w:rPr>
+          <w:rFonts w:ascii="Arial" w:hAnsi="Arial" w:cs="Arial"/>
+          <w:sz w:val="20"/>
+          <w:szCs w:val="20"/>
+        </w:rPr>
+        <w:t>/202</w:t>
+      </w:r>
+      <w:r>
+        <w:rPr>
+          <w:rFonts w:ascii="Arial" w:hAnsi="Arial" w:cs="Arial"/>
+          <w:sz w:val="20"/>
+          <w:szCs w:val="20"/>
+        </w:rPr>
+        <w:t>6</w:t>
+      </w:r>
+    </w:p>
+    <w:p>
+      <w:pPr>
+        <w:ind w:left="-851"/>
+        <w:rPr>
+          <w:rFonts w:ascii="Arial" w:hAnsi="Arial" w:cs="Arial"/>
+          <w:sz w:val="20"/>
+          <w:szCs w:val="20"/>
+        </w:rPr>
+      </w:pPr>
+    </w:p>
+    <w:p>
+      <w:pPr>
+        <w:ind w:left="-851"/>
+        <w:rPr>
+          <w:rFonts w:ascii="Arial" w:hAnsi="Arial" w:cs="Arial"/>
+          <w:sz w:val="20"/>
+          <w:szCs w:val="20"/>
+        </w:rPr>
+      </w:pPr>
+    </w:p>
+    <w:p>
+      <w:pPr>
+        <w:ind w:left="-851"/>
+        <w:rPr>
+          <w:rFonts w:ascii="Arial" w:hAnsi="Arial" w:cs="Arial"/>
+          <w:sz w:val="20"/>
+          <w:szCs w:val="20"/>
+        </w:rPr>
+      </w:pPr>
     </w:p>
     <w:sectPr>
-      <w:headerReference w:type="even" r:id="rId10"/>
-      <w:headerReference w:type="default" r:id="rId11"/>
-      <w:footerReference w:type="even" r:id="rId12"/>
-      <w:footerReference w:type="default" r:id="rId13"/>
-      <w:headerReference w:type="first" r:id="rId14"/>
-      <w:footerReference w:type="first" r:id="rId15"/>
+      <w:headerReference w:type="even" r:id="rId14"/>
+      <w:headerReference w:type="default" r:id="rId15"/>
+      <w:footerReference w:type="even" r:id="rId16"/>
+      <w:footerReference w:type="default" r:id="rId17"/>
+      <w:headerReference w:type="first" r:id="rId18"/>
+      <w:footerReference w:type="first" r:id="rId19"/>
       <w:pgSz w:w="11906" w:h="16838"/>
       <w:pgMar w:top="1985" w:right="991" w:bottom="1560" w:left="1701" w:header="708" w:footer="708" w:gutter="0"/>
       <w:cols w:space="708"/>
@@ -2898,7 +4043,7 @@
 </file>
 
 <file path=word/endnotes.xml><?xml version="1.0" encoding="utf-8"?>
-<w:endnotes xmlns:wpc="http://schemas.microsoft.com/office/word/2010/wordprocessingCanvas" xmlns:cx="http://schemas.microsoft.com/office/drawing/2014/chartex" xmlns:cx1="http://schemas.microsoft.com/office/drawing/2015/9/8/chartex" xmlns:cx2="http://schemas.microsoft.com/office/drawing/2015/10/21/chartex" xmlns:cx3="http://schemas.microsoft.com/office/drawing/2016/5/9/chartex" xmlns:cx4="http://schemas.microsoft.com/office/drawing/2016/5/10/chartex" xmlns:cx5="http://schemas.microsoft.com/office/drawing/2016/5/11/chartex" xmlns:cx6="http://schemas.microsoft.com/office/drawing/2016/5/12/chartex" xmlns:cx7="http://schemas.microsoft.com/office/drawing/2016/5/13/chartex" xmlns:cx8="http://schemas.microsoft.com/office/drawing/2016/5/14/chartex" xmlns:mc="http://schemas.openxmlformats.org/markup-compatibility/2006" xmlns:aink="http://schemas.microsoft.com/office/drawing/2016/ink" xmlns:am3d="http://schemas.microsoft.com/office/drawing/2017/model3d" xmlns:o="urn:schemas-microsoft-com:office:office" xmlns:oel="http://schemas.microsoft.com/office/2019/extlst" xmlns:r="http://schemas.openxmlformats.org/officeDocument/2006/relationships" xmlns:m="http://schemas.openxmlformats.org/officeDocument/2006/math" xmlns:v="urn:schemas-microsoft-com:vml" xmlns:wp14="http://schemas.microsoft.com/office/word/2010/wordprocessingDrawing" xmlns:wp="http://schemas.openxmlformats.org/drawingml/2006/wordprocessingDrawing" xmlns:w10="urn:schemas-microsoft-com:office:word" xmlns:w="http://schemas.openxmlformats.org/wordprocessingml/2006/main" xmlns:w14="http://schemas.microsoft.com/office/word/2010/wordml" xmlns:w15="http://schemas.microsoft.com/office/word/2012/wordml" xmlns:w16cex="http://schemas.microsoft.com/office/word/2018/wordml/cex" xmlns:w16cid="http://schemas.microsoft.com/office/word/2016/wordml/cid" xmlns:w16="http://schemas.microsoft.com/office/word/2018/wordml" xmlns:w16du="http://schemas.microsoft.com/office/word/2023/wordml/word16du" xmlns:w16sdtdh="http://schemas.microsoft.com/office/word/2020/wordml/sdtdatahash" xmlns:w16sdtfl="http://schemas.microsoft.com/office/word/2024/wordml/sdtformatlock" xmlns:w16se="http://schemas.microsoft.com/office/word/2015/wordml/symex" xmlns:wpg="http://schemas.microsoft.com/office/word/2010/wordprocessingGroup" xmlns:wpi="http://schemas.microsoft.com/office/word/2010/wordprocessingInk" xmlns:wne="http://schemas.microsoft.com/office/word/2006/wordml" xmlns:wps="http://schemas.microsoft.com/office/word/2010/wordprocessingShape" mc:Ignorable="w14 w15 w16se w16cid w16 w16cex w16sdtdh w16sdtfl w16du wp14">
+<w:endnotes xmlns:wpc="http://schemas.microsoft.com/office/word/2010/wordprocessingCanvas" xmlns:cx="http://schemas.microsoft.com/office/drawing/2014/chartex" xmlns:cx1="http://schemas.microsoft.com/office/drawing/2015/9/8/chartex" xmlns:cx2="http://schemas.microsoft.com/office/drawing/2015/10/21/chartex" xmlns:cx3="http://schemas.microsoft.com/office/drawing/2016/5/9/chartex" xmlns:cx4="http://schemas.microsoft.com/office/drawing/2016/5/10/chartex" xmlns:cx5="http://schemas.microsoft.com/office/drawing/2016/5/11/chartex" xmlns:cx6="http://schemas.microsoft.com/office/drawing/2016/5/12/chartex" xmlns:cx7="http://schemas.microsoft.com/office/drawing/2016/5/13/chartex" xmlns:cx8="http://schemas.microsoft.com/office/drawing/2016/5/14/chartex" xmlns:mc="http://schemas.openxmlformats.org/markup-compatibility/2006" xmlns:aink="http://schemas.microsoft.com/office/drawing/2016/ink" xmlns:am3d="http://schemas.microsoft.com/office/drawing/2017/model3d" xmlns:o="urn:schemas-microsoft-com:office:office" xmlns:oel="http://schemas.microsoft.com/office/2019/extlst" xmlns:r="http://schemas.openxmlformats.org/officeDocument/2006/relationships" xmlns:m="http://schemas.openxmlformats.org/officeDocument/2006/math" xmlns:v="urn:schemas-microsoft-com:vml" xmlns:wp14="http://schemas.microsoft.com/office/word/2010/wordprocessingDrawing" xmlns:wp="http://schemas.openxmlformats.org/drawingml/2006/wordprocessingDrawing" xmlns:w10="urn:schemas-microsoft-com:office:word" xmlns:w="http://schemas.openxmlformats.org/wordprocessingml/2006/main" xmlns:w14="http://schemas.microsoft.com/office/word/2010/wordml" xmlns:w15="http://schemas.microsoft.com/office/word/2012/wordml" xmlns:w16cex="http://schemas.microsoft.com/office/word/2018/wordml/cex" xmlns:w16cid="http://schemas.microsoft.com/office/word/2016/wordml/cid" xmlns:w16="http://schemas.microsoft.com/office/word/2018/wordml" xmlns:w16sdtdh="http://schemas.microsoft.com/office/word/2020/wordml/sdtdatahash" xmlns:w16se="http://schemas.microsoft.com/office/word/2015/wordml/symex" xmlns:wpg="http://schemas.microsoft.com/office/word/2010/wordprocessingGroup" xmlns:wpi="http://schemas.microsoft.com/office/word/2010/wordprocessingInk" xmlns:wne="http://schemas.microsoft.com/office/word/2006/wordml" xmlns:wps="http://schemas.microsoft.com/office/word/2010/wordprocessingShape" mc:Ignorable="w14 w15 w16se w16cid w16 w16cex w16sdtdh wp14">
   <w:endnote w:type="separator" w:id="-1">
     <w:p>
       <w:pPr>
@@ -2923,7 +4068,7 @@
 </file>
 
 <file path=word/footer1.xml><?xml version="1.0" encoding="utf-8"?>
-<w:ftr xmlns:wpc="http://schemas.microsoft.com/office/word/2010/wordprocessingCanvas" xmlns:cx="http://schemas.microsoft.com/office/drawing/2014/chartex" xmlns:cx1="http://schemas.microsoft.com/office/drawing/2015/9/8/chartex" xmlns:cx2="http://schemas.microsoft.com/office/drawing/2015/10/21/chartex" xmlns:cx3="http://schemas.microsoft.com/office/drawing/2016/5/9/chartex" xmlns:cx4="http://schemas.microsoft.com/office/drawing/2016/5/10/chartex" xmlns:cx5="http://schemas.microsoft.com/office/drawing/2016/5/11/chartex" xmlns:cx6="http://schemas.microsoft.com/office/drawing/2016/5/12/chartex" xmlns:cx7="http://schemas.microsoft.com/office/drawing/2016/5/13/chartex" xmlns:cx8="http://schemas.microsoft.com/office/drawing/2016/5/14/chartex" xmlns:mc="http://schemas.openxmlformats.org/markup-compatibility/2006" xmlns:aink="http://schemas.microsoft.com/office/drawing/2016/ink" xmlns:am3d="http://schemas.microsoft.com/office/drawing/2017/model3d" xmlns:o="urn:schemas-microsoft-com:office:office" xmlns:oel="http://schemas.microsoft.com/office/2019/extlst" xmlns:r="http://schemas.openxmlformats.org/officeDocument/2006/relationships" xmlns:m="http://schemas.openxmlformats.org/officeDocument/2006/math" xmlns:v="urn:schemas-microsoft-com:vml" xmlns:wp14="http://schemas.microsoft.com/office/word/2010/wordprocessingDrawing" xmlns:wp="http://schemas.openxmlformats.org/drawingml/2006/wordprocessingDrawing" xmlns:w10="urn:schemas-microsoft-com:office:word" xmlns:w="http://schemas.openxmlformats.org/wordprocessingml/2006/main" xmlns:w14="http://schemas.microsoft.com/office/word/2010/wordml" xmlns:w15="http://schemas.microsoft.com/office/word/2012/wordml" xmlns:w16cex="http://schemas.microsoft.com/office/word/2018/wordml/cex" xmlns:w16cid="http://schemas.microsoft.com/office/word/2016/wordml/cid" xmlns:w16="http://schemas.microsoft.com/office/word/2018/wordml" xmlns:w16du="http://schemas.microsoft.com/office/word/2023/wordml/word16du" xmlns:w16sdtdh="http://schemas.microsoft.com/office/word/2020/wordml/sdtdatahash" xmlns:w16sdtfl="http://schemas.microsoft.com/office/word/2024/wordml/sdtformatlock" xmlns:w16se="http://schemas.microsoft.com/office/word/2015/wordml/symex" xmlns:wpg="http://schemas.microsoft.com/office/word/2010/wordprocessingGroup" xmlns:wpi="http://schemas.microsoft.com/office/word/2010/wordprocessingInk" xmlns:wne="http://schemas.microsoft.com/office/word/2006/wordml" xmlns:wps="http://schemas.microsoft.com/office/word/2010/wordprocessingShape" mc:Ignorable="w14 w15 w16se w16cid w16 w16cex w16sdtdh w16sdtfl w16du wp14">
+<w:ftr xmlns:wpc="http://schemas.microsoft.com/office/word/2010/wordprocessingCanvas" xmlns:cx="http://schemas.microsoft.com/office/drawing/2014/chartex" xmlns:cx1="http://schemas.microsoft.com/office/drawing/2015/9/8/chartex" xmlns:cx2="http://schemas.microsoft.com/office/drawing/2015/10/21/chartex" xmlns:cx3="http://schemas.microsoft.com/office/drawing/2016/5/9/chartex" xmlns:cx4="http://schemas.microsoft.com/office/drawing/2016/5/10/chartex" xmlns:cx5="http://schemas.microsoft.com/office/drawing/2016/5/11/chartex" xmlns:cx6="http://schemas.microsoft.com/office/drawing/2016/5/12/chartex" xmlns:cx7="http://schemas.microsoft.com/office/drawing/2016/5/13/chartex" xmlns:cx8="http://schemas.microsoft.com/office/drawing/2016/5/14/chartex" xmlns:mc="http://schemas.openxmlformats.org/markup-compatibility/2006" xmlns:aink="http://schemas.microsoft.com/office/drawing/2016/ink" xmlns:am3d="http://schemas.microsoft.com/office/drawing/2017/model3d" xmlns:o="urn:schemas-microsoft-com:office:office" xmlns:oel="http://schemas.microsoft.com/office/2019/extlst" xmlns:r="http://schemas.openxmlformats.org/officeDocument/2006/relationships" xmlns:m="http://schemas.openxmlformats.org/officeDocument/2006/math" xmlns:v="urn:schemas-microsoft-com:vml" xmlns:wp14="http://schemas.microsoft.com/office/word/2010/wordprocessingDrawing" xmlns:wp="http://schemas.openxmlformats.org/drawingml/2006/wordprocessingDrawing" xmlns:w10="urn:schemas-microsoft-com:office:word" xmlns:w="http://schemas.openxmlformats.org/wordprocessingml/2006/main" xmlns:w14="http://schemas.microsoft.com/office/word/2010/wordml" xmlns:w15="http://schemas.microsoft.com/office/word/2012/wordml" xmlns:w16cex="http://schemas.microsoft.com/office/word/2018/wordml/cex" xmlns:w16cid="http://schemas.microsoft.com/office/word/2016/wordml/cid" xmlns:w16="http://schemas.microsoft.com/office/word/2018/wordml" xmlns:w16sdtdh="http://schemas.microsoft.com/office/word/2020/wordml/sdtdatahash" xmlns:w16se="http://schemas.microsoft.com/office/word/2015/wordml/symex" xmlns:wpg="http://schemas.microsoft.com/office/word/2010/wordprocessingGroup" xmlns:wpi="http://schemas.microsoft.com/office/word/2010/wordprocessingInk" xmlns:wne="http://schemas.microsoft.com/office/word/2006/wordml" xmlns:wps="http://schemas.microsoft.com/office/word/2010/wordprocessingShape" mc:Ignorable="w14 w15 w16se w16cid w16 w16cex w16sdtdh wp14">
   <w:p>
     <w:pPr>
       <w:pStyle w:val="Rodap"/>
@@ -2933,7 +4078,7 @@
 </file>
 
 <file path=word/footer2.xml><?xml version="1.0" encoding="utf-8"?>
-<w:ftr xmlns:wpc="http://schemas.microsoft.com/office/word/2010/wordprocessingCanvas" xmlns:cx="http://schemas.microsoft.com/office/drawing/2014/chartex" xmlns:cx1="http://schemas.microsoft.com/office/drawing/2015/9/8/chartex" xmlns:cx2="http://schemas.microsoft.com/office/drawing/2015/10/21/chartex" xmlns:cx3="http://schemas.microsoft.com/office/drawing/2016/5/9/chartex" xmlns:cx4="http://schemas.microsoft.com/office/drawing/2016/5/10/chartex" xmlns:cx5="http://schemas.microsoft.com/office/drawing/2016/5/11/chartex" xmlns:cx6="http://schemas.microsoft.com/office/drawing/2016/5/12/chartex" xmlns:cx7="http://schemas.microsoft.com/office/drawing/2016/5/13/chartex" xmlns:cx8="http://schemas.microsoft.com/office/drawing/2016/5/14/chartex" xmlns:mc="http://schemas.openxmlformats.org/markup-compatibility/2006" xmlns:aink="http://schemas.microsoft.com/office/drawing/2016/ink" xmlns:am3d="http://schemas.microsoft.com/office/drawing/2017/model3d" xmlns:o="urn:schemas-microsoft-com:office:office" xmlns:oel="http://schemas.microsoft.com/office/2019/extlst" xmlns:r="http://schemas.openxmlformats.org/officeDocument/2006/relationships" xmlns:m="http://schemas.openxmlformats.org/officeDocument/2006/math" xmlns:v="urn:schemas-microsoft-com:vml" xmlns:wp14="http://schemas.microsoft.com/office/word/2010/wordprocessingDrawing" xmlns:wp="http://schemas.openxmlformats.org/drawingml/2006/wordprocessingDrawing" xmlns:w10="urn:schemas-microsoft-com:office:word" xmlns:w="http://schemas.openxmlformats.org/wordprocessingml/2006/main" xmlns:w14="http://schemas.microsoft.com/office/word/2010/wordml" xmlns:w15="http://schemas.microsoft.com/office/word/2012/wordml" xmlns:w16cex="http://schemas.microsoft.com/office/word/2018/wordml/cex" xmlns:w16cid="http://schemas.microsoft.com/office/word/2016/wordml/cid" xmlns:w16="http://schemas.microsoft.com/office/word/2018/wordml" xmlns:w16du="http://schemas.microsoft.com/office/word/2023/wordml/word16du" xmlns:w16sdtdh="http://schemas.microsoft.com/office/word/2020/wordml/sdtdatahash" xmlns:w16sdtfl="http://schemas.microsoft.com/office/word/2024/wordml/sdtformatlock" xmlns:w16se="http://schemas.microsoft.com/office/word/2015/wordml/symex" xmlns:wpg="http://schemas.microsoft.com/office/word/2010/wordprocessingGroup" xmlns:wpi="http://schemas.microsoft.com/office/word/2010/wordprocessingInk" xmlns:wne="http://schemas.microsoft.com/office/word/2006/wordml" xmlns:wps="http://schemas.microsoft.com/office/word/2010/wordprocessingShape" mc:Ignorable="w14 w15 w16se w16cid w16 w16cex w16sdtdh w16sdtfl w16du wp14">
+<w:ftr xmlns:wpc="http://schemas.microsoft.com/office/word/2010/wordprocessingCanvas" xmlns:cx="http://schemas.microsoft.com/office/drawing/2014/chartex" xmlns:cx1="http://schemas.microsoft.com/office/drawing/2015/9/8/chartex" xmlns:cx2="http://schemas.microsoft.com/office/drawing/2015/10/21/chartex" xmlns:cx3="http://schemas.microsoft.com/office/drawing/2016/5/9/chartex" xmlns:cx4="http://schemas.microsoft.com/office/drawing/2016/5/10/chartex" xmlns:cx5="http://schemas.microsoft.com/office/drawing/2016/5/11/chartex" xmlns:cx6="http://schemas.microsoft.com/office/drawing/2016/5/12/chartex" xmlns:cx7="http://schemas.microsoft.com/office/drawing/2016/5/13/chartex" xmlns:cx8="http://schemas.microsoft.com/office/drawing/2016/5/14/chartex" xmlns:mc="http://schemas.openxmlformats.org/markup-compatibility/2006" xmlns:aink="http://schemas.microsoft.com/office/drawing/2016/ink" xmlns:am3d="http://schemas.microsoft.com/office/drawing/2017/model3d" xmlns:o="urn:schemas-microsoft-com:office:office" xmlns:oel="http://schemas.microsoft.com/office/2019/extlst" xmlns:r="http://schemas.openxmlformats.org/officeDocument/2006/relationships" xmlns:m="http://schemas.openxmlformats.org/officeDocument/2006/math" xmlns:v="urn:schemas-microsoft-com:vml" xmlns:wp14="http://schemas.microsoft.com/office/word/2010/wordprocessingDrawing" xmlns:wp="http://schemas.openxmlformats.org/drawingml/2006/wordprocessingDrawing" xmlns:w10="urn:schemas-microsoft-com:office:word" xmlns:w="http://schemas.openxmlformats.org/wordprocessingml/2006/main" xmlns:w14="http://schemas.microsoft.com/office/word/2010/wordml" xmlns:w15="http://schemas.microsoft.com/office/word/2012/wordml" xmlns:w16cex="http://schemas.microsoft.com/office/word/2018/wordml/cex" xmlns:w16cid="http://schemas.microsoft.com/office/word/2016/wordml/cid" xmlns:w16="http://schemas.microsoft.com/office/word/2018/wordml" xmlns:w16sdtdh="http://schemas.microsoft.com/office/word/2020/wordml/sdtdatahash" xmlns:w16se="http://schemas.microsoft.com/office/word/2015/wordml/symex" xmlns:wpg="http://schemas.microsoft.com/office/word/2010/wordprocessingGroup" xmlns:wpi="http://schemas.microsoft.com/office/word/2010/wordprocessingInk" xmlns:wne="http://schemas.microsoft.com/office/word/2006/wordml" xmlns:wps="http://schemas.microsoft.com/office/word/2010/wordprocessingShape" mc:Ignorable="w14 w15 w16se w16cid w16 w16cex w16sdtdh wp14">
   <w:p>
     <w:pPr>
       <w:pStyle w:val="Rodap"/>
@@ -2943,7 +4088,7 @@
 </file>
 
 <file path=word/footer3.xml><?xml version="1.0" encoding="utf-8"?>
-<w:ftr xmlns:wpc="http://schemas.microsoft.com/office/word/2010/wordprocessingCanvas" xmlns:cx="http://schemas.microsoft.com/office/drawing/2014/chartex" xmlns:cx1="http://schemas.microsoft.com/office/drawing/2015/9/8/chartex" xmlns:cx2="http://schemas.microsoft.com/office/drawing/2015/10/21/chartex" xmlns:cx3="http://schemas.microsoft.com/office/drawing/2016/5/9/chartex" xmlns:cx4="http://schemas.microsoft.com/office/drawing/2016/5/10/chartex" xmlns:cx5="http://schemas.microsoft.com/office/drawing/2016/5/11/chartex" xmlns:cx6="http://schemas.microsoft.com/office/drawing/2016/5/12/chartex" xmlns:cx7="http://schemas.microsoft.com/office/drawing/2016/5/13/chartex" xmlns:cx8="http://schemas.microsoft.com/office/drawing/2016/5/14/chartex" xmlns:mc="http://schemas.openxmlformats.org/markup-compatibility/2006" xmlns:aink="http://schemas.microsoft.com/office/drawing/2016/ink" xmlns:am3d="http://schemas.microsoft.com/office/drawing/2017/model3d" xmlns:o="urn:schemas-microsoft-com:office:office" xmlns:oel="http://schemas.microsoft.com/office/2019/extlst" xmlns:r="http://schemas.openxmlformats.org/officeDocument/2006/relationships" xmlns:m="http://schemas.openxmlformats.org/officeDocument/2006/math" xmlns:v="urn:schemas-microsoft-com:vml" xmlns:wp14="http://schemas.microsoft.com/office/word/2010/wordprocessingDrawing" xmlns:wp="http://schemas.openxmlformats.org/drawingml/2006/wordprocessingDrawing" xmlns:w10="urn:schemas-microsoft-com:office:word" xmlns:w="http://schemas.openxmlformats.org/wordprocessingml/2006/main" xmlns:w14="http://schemas.microsoft.com/office/word/2010/wordml" xmlns:w15="http://schemas.microsoft.com/office/word/2012/wordml" xmlns:w16cex="http://schemas.microsoft.com/office/word/2018/wordml/cex" xmlns:w16cid="http://schemas.microsoft.com/office/word/2016/wordml/cid" xmlns:w16="http://schemas.microsoft.com/office/word/2018/wordml" xmlns:w16du="http://schemas.microsoft.com/office/word/2023/wordml/word16du" xmlns:w16sdtdh="http://schemas.microsoft.com/office/word/2020/wordml/sdtdatahash" xmlns:w16sdtfl="http://schemas.microsoft.com/office/word/2024/wordml/sdtformatlock" xmlns:w16se="http://schemas.microsoft.com/office/word/2015/wordml/symex" xmlns:wpg="http://schemas.microsoft.com/office/word/2010/wordprocessingGroup" xmlns:wpi="http://schemas.microsoft.com/office/word/2010/wordprocessingInk" xmlns:wne="http://schemas.microsoft.com/office/word/2006/wordml" xmlns:wps="http://schemas.microsoft.com/office/word/2010/wordprocessingShape" mc:Ignorable="w14 w15 w16se w16cid w16 w16cex w16sdtdh w16sdtfl w16du wp14">
+<w:ftr xmlns:wpc="http://schemas.microsoft.com/office/word/2010/wordprocessingCanvas" xmlns:cx="http://schemas.microsoft.com/office/drawing/2014/chartex" xmlns:cx1="http://schemas.microsoft.com/office/drawing/2015/9/8/chartex" xmlns:cx2="http://schemas.microsoft.com/office/drawing/2015/10/21/chartex" xmlns:cx3="http://schemas.microsoft.com/office/drawing/2016/5/9/chartex" xmlns:cx4="http://schemas.microsoft.com/office/drawing/2016/5/10/chartex" xmlns:cx5="http://schemas.microsoft.com/office/drawing/2016/5/11/chartex" xmlns:cx6="http://schemas.microsoft.com/office/drawing/2016/5/12/chartex" xmlns:cx7="http://schemas.microsoft.com/office/drawing/2016/5/13/chartex" xmlns:cx8="http://schemas.microsoft.com/office/drawing/2016/5/14/chartex" xmlns:mc="http://schemas.openxmlformats.org/markup-compatibility/2006" xmlns:aink="http://schemas.microsoft.com/office/drawing/2016/ink" xmlns:am3d="http://schemas.microsoft.com/office/drawing/2017/model3d" xmlns:o="urn:schemas-microsoft-com:office:office" xmlns:oel="http://schemas.microsoft.com/office/2019/extlst" xmlns:r="http://schemas.openxmlformats.org/officeDocument/2006/relationships" xmlns:m="http://schemas.openxmlformats.org/officeDocument/2006/math" xmlns:v="urn:schemas-microsoft-com:vml" xmlns:wp14="http://schemas.microsoft.com/office/word/2010/wordprocessingDrawing" xmlns:wp="http://schemas.openxmlformats.org/drawingml/2006/wordprocessingDrawing" xmlns:w10="urn:schemas-microsoft-com:office:word" xmlns:w="http://schemas.openxmlformats.org/wordprocessingml/2006/main" xmlns:w14="http://schemas.microsoft.com/office/word/2010/wordml" xmlns:w15="http://schemas.microsoft.com/office/word/2012/wordml" xmlns:w16cex="http://schemas.microsoft.com/office/word/2018/wordml/cex" xmlns:w16cid="http://schemas.microsoft.com/office/word/2016/wordml/cid" xmlns:w16="http://schemas.microsoft.com/office/word/2018/wordml" xmlns:w16sdtdh="http://schemas.microsoft.com/office/word/2020/wordml/sdtdatahash" xmlns:w16se="http://schemas.microsoft.com/office/word/2015/wordml/symex" xmlns:wpg="http://schemas.microsoft.com/office/word/2010/wordprocessingGroup" xmlns:wpi="http://schemas.microsoft.com/office/word/2010/wordprocessingInk" xmlns:wne="http://schemas.microsoft.com/office/word/2006/wordml" xmlns:wps="http://schemas.microsoft.com/office/word/2010/wordprocessingShape" mc:Ignorable="w14 w15 w16se w16cid w16 w16cex w16sdtdh wp14">
   <w:p>
     <w:pPr>
       <w:pStyle w:val="Rodap"/>
@@ -2953,7 +4098,7 @@
 </file>
 
 <file path=word/footnotes.xml><?xml version="1.0" encoding="utf-8"?>
-<w:footnotes xmlns:wpc="http://schemas.microsoft.com/office/word/2010/wordprocessingCanvas" xmlns:cx="http://schemas.microsoft.com/office/drawing/2014/chartex" xmlns:cx1="http://schemas.microsoft.com/office/drawing/2015/9/8/chartex" xmlns:cx2="http://schemas.microsoft.com/office/drawing/2015/10/21/chartex" xmlns:cx3="http://schemas.microsoft.com/office/drawing/2016/5/9/chartex" xmlns:cx4="http://schemas.microsoft.com/office/drawing/2016/5/10/chartex" xmlns:cx5="http://schemas.microsoft.com/office/drawing/2016/5/11/chartex" xmlns:cx6="http://schemas.microsoft.com/office/drawing/2016/5/12/chartex" xmlns:cx7="http://schemas.microsoft.com/office/drawing/2016/5/13/chartex" xmlns:cx8="http://schemas.microsoft.com/office/drawing/2016/5/14/chartex" xmlns:mc="http://schemas.openxmlformats.org/markup-compatibility/2006" xmlns:aink="http://schemas.microsoft.com/office/drawing/2016/ink" xmlns:am3d="http://schemas.microsoft.com/office/drawing/2017/model3d" xmlns:o="urn:schemas-microsoft-com:office:office" xmlns:oel="http://schemas.microsoft.com/office/2019/extlst" xmlns:r="http://schemas.openxmlformats.org/officeDocument/2006/relationships" xmlns:m="http://schemas.openxmlformats.org/officeDocument/2006/math" xmlns:v="urn:schemas-microsoft-com:vml" xmlns:wp14="http://schemas.microsoft.com/office/word/2010/wordprocessingDrawing" xmlns:wp="http://schemas.openxmlformats.org/drawingml/2006/wordprocessingDrawing" xmlns:w10="urn:schemas-microsoft-com:office:word" xmlns:w="http://schemas.openxmlformats.org/wordprocessingml/2006/main" xmlns:w14="http://schemas.microsoft.com/office/word/2010/wordml" xmlns:w15="http://schemas.microsoft.com/office/word/2012/wordml" xmlns:w16cex="http://schemas.microsoft.com/office/word/2018/wordml/cex" xmlns:w16cid="http://schemas.microsoft.com/office/word/2016/wordml/cid" xmlns:w16="http://schemas.microsoft.com/office/word/2018/wordml" xmlns:w16du="http://schemas.microsoft.com/office/word/2023/wordml/word16du" xmlns:w16sdtdh="http://schemas.microsoft.com/office/word/2020/wordml/sdtdatahash" xmlns:w16sdtfl="http://schemas.microsoft.com/office/word/2024/wordml/sdtformatlock" xmlns:w16se="http://schemas.microsoft.com/office/word/2015/wordml/symex" xmlns:wpg="http://schemas.microsoft.com/office/word/2010/wordprocessingGroup" xmlns:wpi="http://schemas.microsoft.com/office/word/2010/wordprocessingInk" xmlns:wne="http://schemas.microsoft.com/office/word/2006/wordml" xmlns:wps="http://schemas.microsoft.com/office/word/2010/wordprocessingShape" mc:Ignorable="w14 w15 w16se w16cid w16 w16cex w16sdtdh w16sdtfl w16du wp14">
+<w:footnotes xmlns:wpc="http://schemas.microsoft.com/office/word/2010/wordprocessingCanvas" xmlns:cx="http://schemas.microsoft.com/office/drawing/2014/chartex" xmlns:cx1="http://schemas.microsoft.com/office/drawing/2015/9/8/chartex" xmlns:cx2="http://schemas.microsoft.com/office/drawing/2015/10/21/chartex" xmlns:cx3="http://schemas.microsoft.com/office/drawing/2016/5/9/chartex" xmlns:cx4="http://schemas.microsoft.com/office/drawing/2016/5/10/chartex" xmlns:cx5="http://schemas.microsoft.com/office/drawing/2016/5/11/chartex" xmlns:cx6="http://schemas.microsoft.com/office/drawing/2016/5/12/chartex" xmlns:cx7="http://schemas.microsoft.com/office/drawing/2016/5/13/chartex" xmlns:cx8="http://schemas.microsoft.com/office/drawing/2016/5/14/chartex" xmlns:mc="http://schemas.openxmlformats.org/markup-compatibility/2006" xmlns:aink="http://schemas.microsoft.com/office/drawing/2016/ink" xmlns:am3d="http://schemas.microsoft.com/office/drawing/2017/model3d" xmlns:o="urn:schemas-microsoft-com:office:office" xmlns:oel="http://schemas.microsoft.com/office/2019/extlst" xmlns:r="http://schemas.openxmlformats.org/officeDocument/2006/relationships" xmlns:m="http://schemas.openxmlformats.org/officeDocument/2006/math" xmlns:v="urn:schemas-microsoft-com:vml" xmlns:wp14="http://schemas.microsoft.com/office/word/2010/wordprocessingDrawing" xmlns:wp="http://schemas.openxmlformats.org/drawingml/2006/wordprocessingDrawing" xmlns:w10="urn:schemas-microsoft-com:office:word" xmlns:w="http://schemas.openxmlformats.org/wordprocessingml/2006/main" xmlns:w14="http://schemas.microsoft.com/office/word/2010/wordml" xmlns:w15="http://schemas.microsoft.com/office/word/2012/wordml" xmlns:w16cex="http://schemas.microsoft.com/office/word/2018/wordml/cex" xmlns:w16cid="http://schemas.microsoft.com/office/word/2016/wordml/cid" xmlns:w16="http://schemas.microsoft.com/office/word/2018/wordml" xmlns:w16sdtdh="http://schemas.microsoft.com/office/word/2020/wordml/sdtdatahash" xmlns:w16se="http://schemas.microsoft.com/office/word/2015/wordml/symex" xmlns:wpg="http://schemas.microsoft.com/office/word/2010/wordprocessingGroup" xmlns:wpi="http://schemas.microsoft.com/office/word/2010/wordprocessingInk" xmlns:wne="http://schemas.microsoft.com/office/word/2006/wordml" xmlns:wps="http://schemas.microsoft.com/office/word/2010/wordprocessingShape" mc:Ignorable="w14 w15 w16se w16cid w16 w16cex w16sdtdh wp14">
   <w:footnote w:type="separator" w:id="-1">
     <w:p>
       <w:pPr>
@@ -2978,7 +4123,7 @@
 </file>
 
 <file path=word/header1.xml><?xml version="1.0" encoding="utf-8"?>
-<w:hdr xmlns:wpc="http://schemas.microsoft.com/office/word/2010/wordprocessingCanvas" xmlns:cx="http://schemas.microsoft.com/office/drawing/2014/chartex" xmlns:cx1="http://schemas.microsoft.com/office/drawing/2015/9/8/chartex" xmlns:cx2="http://schemas.microsoft.com/office/drawing/2015/10/21/chartex" xmlns:cx3="http://schemas.microsoft.com/office/drawing/2016/5/9/chartex" xmlns:cx4="http://schemas.microsoft.com/office/drawing/2016/5/10/chartex" xmlns:cx5="http://schemas.microsoft.com/office/drawing/2016/5/11/chartex" xmlns:cx6="http://schemas.microsoft.com/office/drawing/2016/5/12/chartex" xmlns:cx7="http://schemas.microsoft.com/office/drawing/2016/5/13/chartex" xmlns:cx8="http://schemas.microsoft.com/office/drawing/2016/5/14/chartex" xmlns:mc="http://schemas.openxmlformats.org/markup-compatibility/2006" xmlns:aink="http://schemas.microsoft.com/office/drawing/2016/ink" xmlns:am3d="http://schemas.microsoft.com/office/drawing/2017/model3d" xmlns:o="urn:schemas-microsoft-com:office:office" xmlns:oel="http://schemas.microsoft.com/office/2019/extlst" xmlns:r="http://schemas.openxmlformats.org/officeDocument/2006/relationships" xmlns:m="http://schemas.openxmlformats.org/officeDocument/2006/math" xmlns:v="urn:schemas-microsoft-com:vml" xmlns:wp14="http://schemas.microsoft.com/office/word/2010/wordprocessingDrawing" xmlns:wp="http://schemas.openxmlformats.org/drawingml/2006/wordprocessingDrawing" xmlns:w10="urn:schemas-microsoft-com:office:word" xmlns:w="http://schemas.openxmlformats.org/wordprocessingml/2006/main" xmlns:w14="http://schemas.microsoft.com/office/word/2010/wordml" xmlns:w15="http://schemas.microsoft.com/office/word/2012/wordml" xmlns:w16cex="http://schemas.microsoft.com/office/word/2018/wordml/cex" xmlns:w16cid="http://schemas.microsoft.com/office/word/2016/wordml/cid" xmlns:w16="http://schemas.microsoft.com/office/word/2018/wordml" xmlns:w16du="http://schemas.microsoft.com/office/word/2023/wordml/word16du" xmlns:w16sdtdh="http://schemas.microsoft.com/office/word/2020/wordml/sdtdatahash" xmlns:w16sdtfl="http://schemas.microsoft.com/office/word/2024/wordml/sdtformatlock" xmlns:w16se="http://schemas.microsoft.com/office/word/2015/wordml/symex" xmlns:wpg="http://schemas.microsoft.com/office/word/2010/wordprocessingGroup" xmlns:wpi="http://schemas.microsoft.com/office/word/2010/wordprocessingInk" xmlns:wne="http://schemas.microsoft.com/office/word/2006/wordml" xmlns:wps="http://schemas.microsoft.com/office/word/2010/wordprocessingShape" mc:Ignorable="w14 w15 w16se w16cid w16 w16cex w16sdtdh w16sdtfl w16du wp14">
+<w:hdr xmlns:wpc="http://schemas.microsoft.com/office/word/2010/wordprocessingCanvas" xmlns:cx="http://schemas.microsoft.com/office/drawing/2014/chartex" xmlns:cx1="http://schemas.microsoft.com/office/drawing/2015/9/8/chartex" xmlns:cx2="http://schemas.microsoft.com/office/drawing/2015/10/21/chartex" xmlns:cx3="http://schemas.microsoft.com/office/drawing/2016/5/9/chartex" xmlns:cx4="http://schemas.microsoft.com/office/drawing/2016/5/10/chartex" xmlns:cx5="http://schemas.microsoft.com/office/drawing/2016/5/11/chartex" xmlns:cx6="http://schemas.microsoft.com/office/drawing/2016/5/12/chartex" xmlns:cx7="http://schemas.microsoft.com/office/drawing/2016/5/13/chartex" xmlns:cx8="http://schemas.microsoft.com/office/drawing/2016/5/14/chartex" xmlns:mc="http://schemas.openxmlformats.org/markup-compatibility/2006" xmlns:aink="http://schemas.microsoft.com/office/drawing/2016/ink" xmlns:am3d="http://schemas.microsoft.com/office/drawing/2017/model3d" xmlns:o="urn:schemas-microsoft-com:office:office" xmlns:oel="http://schemas.microsoft.com/office/2019/extlst" xmlns:r="http://schemas.openxmlformats.org/officeDocument/2006/relationships" xmlns:m="http://schemas.openxmlformats.org/officeDocument/2006/math" xmlns:v="urn:schemas-microsoft-com:vml" xmlns:wp14="http://schemas.microsoft.com/office/word/2010/wordprocessingDrawing" xmlns:wp="http://schemas.openxmlformats.org/drawingml/2006/wordprocessingDrawing" xmlns:w10="urn:schemas-microsoft-com:office:word" xmlns:w="http://schemas.openxmlformats.org/wordprocessingml/2006/main" xmlns:w14="http://schemas.microsoft.com/office/word/2010/wordml" xmlns:w15="http://schemas.microsoft.com/office/word/2012/wordml" xmlns:w16cex="http://schemas.microsoft.com/office/word/2018/wordml/cex" xmlns:w16cid="http://schemas.microsoft.com/office/word/2016/wordml/cid" xmlns:w16="http://schemas.microsoft.com/office/word/2018/wordml" xmlns:w16sdtdh="http://schemas.microsoft.com/office/word/2020/wordml/sdtdatahash" xmlns:w16se="http://schemas.microsoft.com/office/word/2015/wordml/symex" xmlns:wpg="http://schemas.microsoft.com/office/word/2010/wordprocessingGroup" xmlns:wpi="http://schemas.microsoft.com/office/word/2010/wordprocessingInk" xmlns:wne="http://schemas.microsoft.com/office/word/2006/wordml" xmlns:wps="http://schemas.microsoft.com/office/word/2010/wordprocessingShape" mc:Ignorable="w14 w15 w16se w16cid w16 w16cex w16sdtdh wp14">
   <w:p>
     <w:pPr>
       <w:pStyle w:val="Cabealho"/>
@@ -2988,7 +4133,7 @@
 </file>
 
 <file path=word/header2.xml><?xml version="1.0" encoding="utf-8"?>
-<w:hdr xmlns:wpc="http://schemas.microsoft.com/office/word/2010/wordprocessingCanvas" xmlns:cx="http://schemas.microsoft.com/office/drawing/2014/chartex" xmlns:cx1="http://schemas.microsoft.com/office/drawing/2015/9/8/chartex" xmlns:cx2="http://schemas.microsoft.com/office/drawing/2015/10/21/chartex" xmlns:cx3="http://schemas.microsoft.com/office/drawing/2016/5/9/chartex" xmlns:cx4="http://schemas.microsoft.com/office/drawing/2016/5/10/chartex" xmlns:cx5="http://schemas.microsoft.com/office/drawing/2016/5/11/chartex" xmlns:cx6="http://schemas.microsoft.com/office/drawing/2016/5/12/chartex" xmlns:cx7="http://schemas.microsoft.com/office/drawing/2016/5/13/chartex" xmlns:cx8="http://schemas.microsoft.com/office/drawing/2016/5/14/chartex" xmlns:mc="http://schemas.openxmlformats.org/markup-compatibility/2006" xmlns:aink="http://schemas.microsoft.com/office/drawing/2016/ink" xmlns:am3d="http://schemas.microsoft.com/office/drawing/2017/model3d" xmlns:o="urn:schemas-microsoft-com:office:office" xmlns:oel="http://schemas.microsoft.com/office/2019/extlst" xmlns:r="http://schemas.openxmlformats.org/officeDocument/2006/relationships" xmlns:m="http://schemas.openxmlformats.org/officeDocument/2006/math" xmlns:v="urn:schemas-microsoft-com:vml" xmlns:wp14="http://schemas.microsoft.com/office/word/2010/wordprocessingDrawing" xmlns:wp="http://schemas.openxmlformats.org/drawingml/2006/wordprocessingDrawing" xmlns:w10="urn:schemas-microsoft-com:office:word" xmlns:w="http://schemas.openxmlformats.org/wordprocessingml/2006/main" xmlns:w14="http://schemas.microsoft.com/office/word/2010/wordml" xmlns:w15="http://schemas.microsoft.com/office/word/2012/wordml" xmlns:w16cex="http://schemas.microsoft.com/office/word/2018/wordml/cex" xmlns:w16cid="http://schemas.microsoft.com/office/word/2016/wordml/cid" xmlns:w16="http://schemas.microsoft.com/office/word/2018/wordml" xmlns:w16du="http://schemas.microsoft.com/office/word/2023/wordml/word16du" xmlns:w16sdtdh="http://schemas.microsoft.com/office/word/2020/wordml/sdtdatahash" xmlns:w16sdtfl="http://schemas.microsoft.com/office/word/2024/wordml/sdtformatlock" xmlns:w16se="http://schemas.microsoft.com/office/word/2015/wordml/symex" xmlns:wpg="http://schemas.microsoft.com/office/word/2010/wordprocessingGroup" xmlns:wpi="http://schemas.microsoft.com/office/word/2010/wordprocessingInk" xmlns:wne="http://schemas.microsoft.com/office/word/2006/wordml" xmlns:wps="http://schemas.microsoft.com/office/word/2010/wordprocessingShape" mc:Ignorable="w14 w15 w16se w16cid w16 w16cex w16sdtdh w16sdtfl w16du wp14">
+<w:hdr xmlns:wpc="http://schemas.microsoft.com/office/word/2010/wordprocessingCanvas" xmlns:cx="http://schemas.microsoft.com/office/drawing/2014/chartex" xmlns:cx1="http://schemas.microsoft.com/office/drawing/2015/9/8/chartex" xmlns:cx2="http://schemas.microsoft.com/office/drawing/2015/10/21/chartex" xmlns:cx3="http://schemas.microsoft.com/office/drawing/2016/5/9/chartex" xmlns:cx4="http://schemas.microsoft.com/office/drawing/2016/5/10/chartex" xmlns:cx5="http://schemas.microsoft.com/office/drawing/2016/5/11/chartex" xmlns:cx6="http://schemas.microsoft.com/office/drawing/2016/5/12/chartex" xmlns:cx7="http://schemas.microsoft.com/office/drawing/2016/5/13/chartex" xmlns:cx8="http://schemas.microsoft.com/office/drawing/2016/5/14/chartex" xmlns:mc="http://schemas.openxmlformats.org/markup-compatibility/2006" xmlns:aink="http://schemas.microsoft.com/office/drawing/2016/ink" xmlns:am3d="http://schemas.microsoft.com/office/drawing/2017/model3d" xmlns:o="urn:schemas-microsoft-com:office:office" xmlns:oel="http://schemas.microsoft.com/office/2019/extlst" xmlns:r="http://schemas.openxmlformats.org/officeDocument/2006/relationships" xmlns:m="http://schemas.openxmlformats.org/officeDocument/2006/math" xmlns:v="urn:schemas-microsoft-com:vml" xmlns:wp14="http://schemas.microsoft.com/office/word/2010/wordprocessingDrawing" xmlns:wp="http://schemas.openxmlformats.org/drawingml/2006/wordprocessingDrawing" xmlns:w10="urn:schemas-microsoft-com:office:word" xmlns:w="http://schemas.openxmlformats.org/wordprocessingml/2006/main" xmlns:w14="http://schemas.microsoft.com/office/word/2010/wordml" xmlns:w15="http://schemas.microsoft.com/office/word/2012/wordml" xmlns:w16cex="http://schemas.microsoft.com/office/word/2018/wordml/cex" xmlns:w16cid="http://schemas.microsoft.com/office/word/2016/wordml/cid" xmlns:w16="http://schemas.microsoft.com/office/word/2018/wordml" xmlns:w16sdtdh="http://schemas.microsoft.com/office/word/2020/wordml/sdtdatahash" xmlns:w16se="http://schemas.microsoft.com/office/word/2015/wordml/symex" xmlns:wpg="http://schemas.microsoft.com/office/word/2010/wordprocessingGroup" xmlns:wpi="http://schemas.microsoft.com/office/word/2010/wordprocessingInk" xmlns:wne="http://schemas.microsoft.com/office/word/2006/wordml" xmlns:wps="http://schemas.microsoft.com/office/word/2010/wordprocessingShape" mc:Ignorable="w14 w15 w16se w16cid w16 w16cex w16sdtdh wp14">
   <w:p>
     <w:pPr>
       <w:pStyle w:val="Cabealho"/>
@@ -3058,7 +4203,7 @@
 </file>
 
 <file path=word/header3.xml><?xml version="1.0" encoding="utf-8"?>
-<w:hdr xmlns:wpc="http://schemas.microsoft.com/office/word/2010/wordprocessingCanvas" xmlns:cx="http://schemas.microsoft.com/office/drawing/2014/chartex" xmlns:cx1="http://schemas.microsoft.com/office/drawing/2015/9/8/chartex" xmlns:cx2="http://schemas.microsoft.com/office/drawing/2015/10/21/chartex" xmlns:cx3="http://schemas.microsoft.com/office/drawing/2016/5/9/chartex" xmlns:cx4="http://schemas.microsoft.com/office/drawing/2016/5/10/chartex" xmlns:cx5="http://schemas.microsoft.com/office/drawing/2016/5/11/chartex" xmlns:cx6="http://schemas.microsoft.com/office/drawing/2016/5/12/chartex" xmlns:cx7="http://schemas.microsoft.com/office/drawing/2016/5/13/chartex" xmlns:cx8="http://schemas.microsoft.com/office/drawing/2016/5/14/chartex" xmlns:mc="http://schemas.openxmlformats.org/markup-compatibility/2006" xmlns:aink="http://schemas.microsoft.com/office/drawing/2016/ink" xmlns:am3d="http://schemas.microsoft.com/office/drawing/2017/model3d" xmlns:o="urn:schemas-microsoft-com:office:office" xmlns:oel="http://schemas.microsoft.com/office/2019/extlst" xmlns:r="http://schemas.openxmlformats.org/officeDocument/2006/relationships" xmlns:m="http://schemas.openxmlformats.org/officeDocument/2006/math" xmlns:v="urn:schemas-microsoft-com:vml" xmlns:wp14="http://schemas.microsoft.com/office/word/2010/wordprocessingDrawing" xmlns:wp="http://schemas.openxmlformats.org/drawingml/2006/wordprocessingDrawing" xmlns:w10="urn:schemas-microsoft-com:office:word" xmlns:w="http://schemas.openxmlformats.org/wordprocessingml/2006/main" xmlns:w14="http://schemas.microsoft.com/office/word/2010/wordml" xmlns:w15="http://schemas.microsoft.com/office/word/2012/wordml" xmlns:w16cex="http://schemas.microsoft.com/office/word/2018/wordml/cex" xmlns:w16cid="http://schemas.microsoft.com/office/word/2016/wordml/cid" xmlns:w16="http://schemas.microsoft.com/office/word/2018/wordml" xmlns:w16du="http://schemas.microsoft.com/office/word/2023/wordml/word16du" xmlns:w16sdtdh="http://schemas.microsoft.com/office/word/2020/wordml/sdtdatahash" xmlns:w16sdtfl="http://schemas.microsoft.com/office/word/2024/wordml/sdtformatlock" xmlns:w16se="http://schemas.microsoft.com/office/word/2015/wordml/symex" xmlns:wpg="http://schemas.microsoft.com/office/word/2010/wordprocessingGroup" xmlns:wpi="http://schemas.microsoft.com/office/word/2010/wordprocessingInk" xmlns:wne="http://schemas.microsoft.com/office/word/2006/wordml" xmlns:wps="http://schemas.microsoft.com/office/word/2010/wordprocessingShape" mc:Ignorable="w14 w15 w16se w16cid w16 w16cex w16sdtdh w16sdtfl w16du wp14">
+<w:hdr xmlns:wpc="http://schemas.microsoft.com/office/word/2010/wordprocessingCanvas" xmlns:cx="http://schemas.microsoft.com/office/drawing/2014/chartex" xmlns:cx1="http://schemas.microsoft.com/office/drawing/2015/9/8/chartex" xmlns:cx2="http://schemas.microsoft.com/office/drawing/2015/10/21/chartex" xmlns:cx3="http://schemas.microsoft.com/office/drawing/2016/5/9/chartex" xmlns:cx4="http://schemas.microsoft.com/office/drawing/2016/5/10/chartex" xmlns:cx5="http://schemas.microsoft.com/office/drawing/2016/5/11/chartex" xmlns:cx6="http://schemas.microsoft.com/office/drawing/2016/5/12/chartex" xmlns:cx7="http://schemas.microsoft.com/office/drawing/2016/5/13/chartex" xmlns:cx8="http://schemas.microsoft.com/office/drawing/2016/5/14/chartex" xmlns:mc="http://schemas.openxmlformats.org/markup-compatibility/2006" xmlns:aink="http://schemas.microsoft.com/office/drawing/2016/ink" xmlns:am3d="http://schemas.microsoft.com/office/drawing/2017/model3d" xmlns:o="urn:schemas-microsoft-com:office:office" xmlns:oel="http://schemas.microsoft.com/office/2019/extlst" xmlns:r="http://schemas.openxmlformats.org/officeDocument/2006/relationships" xmlns:m="http://schemas.openxmlformats.org/officeDocument/2006/math" xmlns:v="urn:schemas-microsoft-com:vml" xmlns:wp14="http://schemas.microsoft.com/office/word/2010/wordprocessingDrawing" xmlns:wp="http://schemas.openxmlformats.org/drawingml/2006/wordprocessingDrawing" xmlns:w10="urn:schemas-microsoft-com:office:word" xmlns:w="http://schemas.openxmlformats.org/wordprocessingml/2006/main" xmlns:w14="http://schemas.microsoft.com/office/word/2010/wordml" xmlns:w15="http://schemas.microsoft.com/office/word/2012/wordml" xmlns:w16cex="http://schemas.microsoft.com/office/word/2018/wordml/cex" xmlns:w16cid="http://schemas.microsoft.com/office/word/2016/wordml/cid" xmlns:w16="http://schemas.microsoft.com/office/word/2018/wordml" xmlns:w16sdtdh="http://schemas.microsoft.com/office/word/2020/wordml/sdtdatahash" xmlns:w16se="http://schemas.microsoft.com/office/word/2015/wordml/symex" xmlns:wpg="http://schemas.microsoft.com/office/word/2010/wordprocessingGroup" xmlns:wpi="http://schemas.microsoft.com/office/word/2010/wordprocessingInk" xmlns:wne="http://schemas.microsoft.com/office/word/2006/wordml" xmlns:wps="http://schemas.microsoft.com/office/word/2010/wordprocessingShape" mc:Ignorable="w14 w15 w16se w16cid w16 w16cex w16sdtdh wp14">
   <w:p>
     <w:pPr>
       <w:pStyle w:val="Cabealho"/>
@@ -3068,7 +4213,7 @@
 </file>
 
 <file path=word/numbering.xml><?xml version="1.0" encoding="utf-8"?>
-<w:numbering xmlns:wpc="http://schemas.microsoft.com/office/word/2010/wordprocessingCanvas" xmlns:cx="http://schemas.microsoft.com/office/drawing/2014/chartex" xmlns:cx1="http://schemas.microsoft.com/office/drawing/2015/9/8/chartex" xmlns:cx2="http://schemas.microsoft.com/office/drawing/2015/10/21/chartex" xmlns:cx3="http://schemas.microsoft.com/office/drawing/2016/5/9/chartex" xmlns:cx4="http://schemas.microsoft.com/office/drawing/2016/5/10/chartex" xmlns:cx5="http://schemas.microsoft.com/office/drawing/2016/5/11/chartex" xmlns:cx6="http://schemas.microsoft.com/office/drawing/2016/5/12/chartex" xmlns:cx7="http://schemas.microsoft.com/office/drawing/2016/5/13/chartex" xmlns:cx8="http://schemas.microsoft.com/office/drawing/2016/5/14/chartex" xmlns:mc="http://schemas.openxmlformats.org/markup-compatibility/2006" xmlns:aink="http://schemas.microsoft.com/office/drawing/2016/ink" xmlns:am3d="http://schemas.microsoft.com/office/drawing/2017/model3d" xmlns:o="urn:schemas-microsoft-com:office:office" xmlns:oel="http://schemas.microsoft.com/office/2019/extlst" xmlns:r="http://schemas.openxmlformats.org/officeDocument/2006/relationships" xmlns:m="http://schemas.openxmlformats.org/officeDocument/2006/math" xmlns:v="urn:schemas-microsoft-com:vml" xmlns:wp14="http://schemas.microsoft.com/office/word/2010/wordprocessingDrawing" xmlns:wp="http://schemas.openxmlformats.org/drawingml/2006/wordprocessingDrawing" xmlns:w10="urn:schemas-microsoft-com:office:word" xmlns:w="http://schemas.openxmlformats.org/wordprocessingml/2006/main" xmlns:w14="http://schemas.microsoft.com/office/word/2010/wordml" xmlns:w15="http://schemas.microsoft.com/office/word/2012/wordml" xmlns:w16cex="http://schemas.microsoft.com/office/word/2018/wordml/cex" xmlns:w16cid="http://schemas.microsoft.com/office/word/2016/wordml/cid" xmlns:w16="http://schemas.microsoft.com/office/word/2018/wordml" xmlns:w16du="http://schemas.microsoft.com/office/word/2023/wordml/word16du" xmlns:w16sdtdh="http://schemas.microsoft.com/office/word/2020/wordml/sdtdatahash" xmlns:w16sdtfl="http://schemas.microsoft.com/office/word/2024/wordml/sdtformatlock" xmlns:w16se="http://schemas.microsoft.com/office/word/2015/wordml/symex" xmlns:wpg="http://schemas.microsoft.com/office/word/2010/wordprocessingGroup" xmlns:wpi="http://schemas.microsoft.com/office/word/2010/wordprocessingInk" xmlns:wne="http://schemas.microsoft.com/office/word/2006/wordml" xmlns:wps="http://schemas.microsoft.com/office/word/2010/wordprocessingShape" mc:Ignorable="w14 w15 w16se w16cid w16 w16cex w16sdtdh w16sdtfl w16du wp14">
+<w:numbering xmlns:wpc="http://schemas.microsoft.com/office/word/2010/wordprocessingCanvas" xmlns:cx="http://schemas.microsoft.com/office/drawing/2014/chartex" xmlns:cx1="http://schemas.microsoft.com/office/drawing/2015/9/8/chartex" xmlns:cx2="http://schemas.microsoft.com/office/drawing/2015/10/21/chartex" xmlns:cx3="http://schemas.microsoft.com/office/drawing/2016/5/9/chartex" xmlns:cx4="http://schemas.microsoft.com/office/drawing/2016/5/10/chartex" xmlns:cx5="http://schemas.microsoft.com/office/drawing/2016/5/11/chartex" xmlns:cx6="http://schemas.microsoft.com/office/drawing/2016/5/12/chartex" xmlns:cx7="http://schemas.microsoft.com/office/drawing/2016/5/13/chartex" xmlns:cx8="http://schemas.microsoft.com/office/drawing/2016/5/14/chartex" xmlns:mc="http://schemas.openxmlformats.org/markup-compatibility/2006" xmlns:aink="http://schemas.microsoft.com/office/drawing/2016/ink" xmlns:am3d="http://schemas.microsoft.com/office/drawing/2017/model3d" xmlns:o="urn:schemas-microsoft-com:office:office" xmlns:oel="http://schemas.microsoft.com/office/2019/extlst" xmlns:r="http://schemas.openxmlformats.org/officeDocument/2006/relationships" xmlns:m="http://schemas.openxmlformats.org/officeDocument/2006/math" xmlns:v="urn:schemas-microsoft-com:vml" xmlns:wp14="http://schemas.microsoft.com/office/word/2010/wordprocessingDrawing" xmlns:wp="http://schemas.openxmlformats.org/drawingml/2006/wordprocessingDrawing" xmlns:w10="urn:schemas-microsoft-com:office:word" xmlns:w="http://schemas.openxmlformats.org/wordprocessingml/2006/main" xmlns:w14="http://schemas.microsoft.com/office/word/2010/wordml" xmlns:w15="http://schemas.microsoft.com/office/word/2012/wordml" xmlns:w16cex="http://schemas.microsoft.com/office/word/2018/wordml/cex" xmlns:w16cid="http://schemas.microsoft.com/office/word/2016/wordml/cid" xmlns:w16="http://schemas.microsoft.com/office/word/2018/wordml" xmlns:w16sdtdh="http://schemas.microsoft.com/office/word/2020/wordml/sdtdatahash" xmlns:w16se="http://schemas.microsoft.com/office/word/2015/wordml/symex" xmlns:wpg="http://schemas.microsoft.com/office/word/2010/wordprocessingGroup" xmlns:wpi="http://schemas.microsoft.com/office/word/2010/wordprocessingInk" xmlns:wne="http://schemas.microsoft.com/office/word/2006/wordml" xmlns:wps="http://schemas.microsoft.com/office/word/2010/wordprocessingShape" mc:Ignorable="w14 w15 w16se w16cid w16 w16cex w16sdtdh wp14">
   <w:abstractNum w:abstractNumId="0" w15:restartNumberingAfterBreak="0">
     <w:nsid w:val="17913EB3"/>
     <w:multiLevelType w:val="multilevel"/>
@@ -3155,14 +4300,470 @@
       </w:pPr>
     </w:lvl>
   </w:abstractNum>
+  <w:abstractNum w:abstractNumId="1" w15:restartNumberingAfterBreak="0">
+    <w:nsid w:val="26AA770C"/>
+    <w:multiLevelType w:val="multilevel"/>
+    <w:tmpl w:val="D66EB95C"/>
+    <w:lvl w:ilvl="0">
+      <w:start w:val="1"/>
+      <w:numFmt w:val="bullet"/>
+      <w:lvlText w:val=""/>
+      <w:lvlJc w:val="left"/>
+      <w:pPr>
+        <w:tabs>
+          <w:tab w:val="num" w:pos="720"/>
+        </w:tabs>
+        <w:ind w:left="720" w:hanging="360"/>
+      </w:pPr>
+      <w:rPr>
+        <w:rFonts w:ascii="Symbol" w:hAnsi="Symbol" w:hint="default"/>
+        <w:sz w:val="20"/>
+      </w:rPr>
+    </w:lvl>
+    <w:lvl w:ilvl="1" w:tentative="1">
+      <w:start w:val="1"/>
+      <w:numFmt w:val="bullet"/>
+      <w:lvlText w:val="o"/>
+      <w:lvlJc w:val="left"/>
+      <w:pPr>
+        <w:tabs>
+          <w:tab w:val="num" w:pos="1440"/>
+        </w:tabs>
+        <w:ind w:left="1440" w:hanging="360"/>
+      </w:pPr>
+      <w:rPr>
+        <w:rFonts w:ascii="Courier New" w:hAnsi="Courier New" w:hint="default"/>
+        <w:sz w:val="20"/>
+      </w:rPr>
+    </w:lvl>
+    <w:lvl w:ilvl="2" w:tentative="1">
+      <w:start w:val="1"/>
+      <w:numFmt w:val="bullet"/>
+      <w:lvlText w:val=""/>
+      <w:lvlJc w:val="left"/>
+      <w:pPr>
+        <w:tabs>
+          <w:tab w:val="num" w:pos="2160"/>
+        </w:tabs>
+        <w:ind w:left="2160" w:hanging="360"/>
+      </w:pPr>
+      <w:rPr>
+        <w:rFonts w:ascii="Wingdings" w:hAnsi="Wingdings" w:hint="default"/>
+        <w:sz w:val="20"/>
+      </w:rPr>
+    </w:lvl>
+    <w:lvl w:ilvl="3" w:tentative="1">
+      <w:start w:val="1"/>
+      <w:numFmt w:val="bullet"/>
+      <w:lvlText w:val=""/>
+      <w:lvlJc w:val="left"/>
+      <w:pPr>
+        <w:tabs>
+          <w:tab w:val="num" w:pos="2880"/>
+        </w:tabs>
+        <w:ind w:left="2880" w:hanging="360"/>
+      </w:pPr>
+      <w:rPr>
+        <w:rFonts w:ascii="Wingdings" w:hAnsi="Wingdings" w:hint="default"/>
+        <w:sz w:val="20"/>
+      </w:rPr>
+    </w:lvl>
+    <w:lvl w:ilvl="4" w:tentative="1">
+      <w:start w:val="1"/>
+      <w:numFmt w:val="bullet"/>
+      <w:lvlText w:val=""/>
+      <w:lvlJc w:val="left"/>
+      <w:pPr>
+        <w:tabs>
+          <w:tab w:val="num" w:pos="3600"/>
+        </w:tabs>
+        <w:ind w:left="3600" w:hanging="360"/>
+      </w:pPr>
+      <w:rPr>
+        <w:rFonts w:ascii="Wingdings" w:hAnsi="Wingdings" w:hint="default"/>
+        <w:sz w:val="20"/>
+      </w:rPr>
+    </w:lvl>
+    <w:lvl w:ilvl="5" w:tentative="1">
+      <w:start w:val="1"/>
+      <w:numFmt w:val="bullet"/>
+      <w:lvlText w:val=""/>
+      <w:lvlJc w:val="left"/>
+      <w:pPr>
+        <w:tabs>
+          <w:tab w:val="num" w:pos="4320"/>
+        </w:tabs>
+        <w:ind w:left="4320" w:hanging="360"/>
+      </w:pPr>
+      <w:rPr>
+        <w:rFonts w:ascii="Wingdings" w:hAnsi="Wingdings" w:hint="default"/>
+        <w:sz w:val="20"/>
+      </w:rPr>
+    </w:lvl>
+    <w:lvl w:ilvl="6" w:tentative="1">
+      <w:start w:val="1"/>
+      <w:numFmt w:val="bullet"/>
+      <w:lvlText w:val=""/>
+      <w:lvlJc w:val="left"/>
+      <w:pPr>
+        <w:tabs>
+          <w:tab w:val="num" w:pos="5040"/>
+        </w:tabs>
+        <w:ind w:left="5040" w:hanging="360"/>
+      </w:pPr>
+      <w:rPr>
+        <w:rFonts w:ascii="Wingdings" w:hAnsi="Wingdings" w:hint="default"/>
+        <w:sz w:val="20"/>
+      </w:rPr>
+    </w:lvl>
+    <w:lvl w:ilvl="7" w:tentative="1">
+      <w:start w:val="1"/>
+      <w:numFmt w:val="bullet"/>
+      <w:lvlText w:val=""/>
+      <w:lvlJc w:val="left"/>
+      <w:pPr>
+        <w:tabs>
+          <w:tab w:val="num" w:pos="5760"/>
+        </w:tabs>
+        <w:ind w:left="5760" w:hanging="360"/>
+      </w:pPr>
+      <w:rPr>
+        <w:rFonts w:ascii="Wingdings" w:hAnsi="Wingdings" w:hint="default"/>
+        <w:sz w:val="20"/>
+      </w:rPr>
+    </w:lvl>
+    <w:lvl w:ilvl="8" w:tentative="1">
+      <w:start w:val="1"/>
+      <w:numFmt w:val="bullet"/>
+      <w:lvlText w:val=""/>
+      <w:lvlJc w:val="left"/>
+      <w:pPr>
+        <w:tabs>
+          <w:tab w:val="num" w:pos="6480"/>
+        </w:tabs>
+        <w:ind w:left="6480" w:hanging="360"/>
+      </w:pPr>
+      <w:rPr>
+        <w:rFonts w:ascii="Wingdings" w:hAnsi="Wingdings" w:hint="default"/>
+        <w:sz w:val="20"/>
+      </w:rPr>
+    </w:lvl>
+  </w:abstractNum>
+  <w:abstractNum w:abstractNumId="2" w15:restartNumberingAfterBreak="0">
+    <w:nsid w:val="38915575"/>
+    <w:multiLevelType w:val="multilevel"/>
+    <w:tmpl w:val="42B8F078"/>
+    <w:lvl w:ilvl="0">
+      <w:start w:val="1"/>
+      <w:numFmt w:val="bullet"/>
+      <w:lvlText w:val=""/>
+      <w:lvlJc w:val="left"/>
+      <w:pPr>
+        <w:tabs>
+          <w:tab w:val="num" w:pos="720"/>
+        </w:tabs>
+        <w:ind w:left="720" w:hanging="360"/>
+      </w:pPr>
+      <w:rPr>
+        <w:rFonts w:ascii="Symbol" w:hAnsi="Symbol" w:hint="default"/>
+        <w:sz w:val="20"/>
+      </w:rPr>
+    </w:lvl>
+    <w:lvl w:ilvl="1" w:tentative="1">
+      <w:start w:val="1"/>
+      <w:numFmt w:val="bullet"/>
+      <w:lvlText w:val="o"/>
+      <w:lvlJc w:val="left"/>
+      <w:pPr>
+        <w:tabs>
+          <w:tab w:val="num" w:pos="1440"/>
+        </w:tabs>
+        <w:ind w:left="1440" w:hanging="360"/>
+      </w:pPr>
+      <w:rPr>
+        <w:rFonts w:ascii="Courier New" w:hAnsi="Courier New" w:hint="default"/>
+        <w:sz w:val="20"/>
+      </w:rPr>
+    </w:lvl>
+    <w:lvl w:ilvl="2" w:tentative="1">
+      <w:start w:val="1"/>
+      <w:numFmt w:val="bullet"/>
+      <w:lvlText w:val=""/>
+      <w:lvlJc w:val="left"/>
+      <w:pPr>
+        <w:tabs>
+          <w:tab w:val="num" w:pos="2160"/>
+        </w:tabs>
+        <w:ind w:left="2160" w:hanging="360"/>
+      </w:pPr>
+      <w:rPr>
+        <w:rFonts w:ascii="Wingdings" w:hAnsi="Wingdings" w:hint="default"/>
+        <w:sz w:val="20"/>
+      </w:rPr>
+    </w:lvl>
+    <w:lvl w:ilvl="3" w:tentative="1">
+      <w:start w:val="1"/>
+      <w:numFmt w:val="bullet"/>
+      <w:lvlText w:val=""/>
+      <w:lvlJc w:val="left"/>
+      <w:pPr>
+        <w:tabs>
+          <w:tab w:val="num" w:pos="2880"/>
+        </w:tabs>
+        <w:ind w:left="2880" w:hanging="360"/>
+      </w:pPr>
+      <w:rPr>
+        <w:rFonts w:ascii="Wingdings" w:hAnsi="Wingdings" w:hint="default"/>
+        <w:sz w:val="20"/>
+      </w:rPr>
+    </w:lvl>
+    <w:lvl w:ilvl="4" w:tentative="1">
+      <w:start w:val="1"/>
+      <w:numFmt w:val="bullet"/>
+      <w:lvlText w:val=""/>
+      <w:lvlJc w:val="left"/>
+      <w:pPr>
+        <w:tabs>
+          <w:tab w:val="num" w:pos="3600"/>
+        </w:tabs>
+        <w:ind w:left="3600" w:hanging="360"/>
+      </w:pPr>
+      <w:rPr>
+        <w:rFonts w:ascii="Wingdings" w:hAnsi="Wingdings" w:hint="default"/>
+        <w:sz w:val="20"/>
+      </w:rPr>
+    </w:lvl>
+    <w:lvl w:ilvl="5" w:tentative="1">
+      <w:start w:val="1"/>
+      <w:numFmt w:val="bullet"/>
+      <w:lvlText w:val=""/>
+      <w:lvlJc w:val="left"/>
+      <w:pPr>
+        <w:tabs>
+          <w:tab w:val="num" w:pos="4320"/>
+        </w:tabs>
+        <w:ind w:left="4320" w:hanging="360"/>
+      </w:pPr>
+      <w:rPr>
+        <w:rFonts w:ascii="Wingdings" w:hAnsi="Wingdings" w:hint="default"/>
+        <w:sz w:val="20"/>
+      </w:rPr>
+    </w:lvl>
+    <w:lvl w:ilvl="6" w:tentative="1">
+      <w:start w:val="1"/>
+      <w:numFmt w:val="bullet"/>
+      <w:lvlText w:val=""/>
+      <w:lvlJc w:val="left"/>
+      <w:pPr>
+        <w:tabs>
+          <w:tab w:val="num" w:pos="5040"/>
+        </w:tabs>
+        <w:ind w:left="5040" w:hanging="360"/>
+      </w:pPr>
+      <w:rPr>
+        <w:rFonts w:ascii="Wingdings" w:hAnsi="Wingdings" w:hint="default"/>
+        <w:sz w:val="20"/>
+      </w:rPr>
+    </w:lvl>
+    <w:lvl w:ilvl="7" w:tentative="1">
+      <w:start w:val="1"/>
+      <w:numFmt w:val="bullet"/>
+      <w:lvlText w:val=""/>
+      <w:lvlJc w:val="left"/>
+      <w:pPr>
+        <w:tabs>
+          <w:tab w:val="num" w:pos="5760"/>
+        </w:tabs>
+        <w:ind w:left="5760" w:hanging="360"/>
+      </w:pPr>
+      <w:rPr>
+        <w:rFonts w:ascii="Wingdings" w:hAnsi="Wingdings" w:hint="default"/>
+        <w:sz w:val="20"/>
+      </w:rPr>
+    </w:lvl>
+    <w:lvl w:ilvl="8" w:tentative="1">
+      <w:start w:val="1"/>
+      <w:numFmt w:val="bullet"/>
+      <w:lvlText w:val=""/>
+      <w:lvlJc w:val="left"/>
+      <w:pPr>
+        <w:tabs>
+          <w:tab w:val="num" w:pos="6480"/>
+        </w:tabs>
+        <w:ind w:left="6480" w:hanging="360"/>
+      </w:pPr>
+      <w:rPr>
+        <w:rFonts w:ascii="Wingdings" w:hAnsi="Wingdings" w:hint="default"/>
+        <w:sz w:val="20"/>
+      </w:rPr>
+    </w:lvl>
+  </w:abstractNum>
+  <w:abstractNum w:abstractNumId="3" w15:restartNumberingAfterBreak="0">
+    <w:nsid w:val="60A201E0"/>
+    <w:multiLevelType w:val="multilevel"/>
+    <w:tmpl w:val="49D03D0E"/>
+    <w:lvl w:ilvl="0">
+      <w:start w:val="1"/>
+      <w:numFmt w:val="bullet"/>
+      <w:lvlText w:val=""/>
+      <w:lvlJc w:val="left"/>
+      <w:pPr>
+        <w:tabs>
+          <w:tab w:val="num" w:pos="720"/>
+        </w:tabs>
+        <w:ind w:left="720" w:hanging="360"/>
+      </w:pPr>
+      <w:rPr>
+        <w:rFonts w:ascii="Symbol" w:hAnsi="Symbol" w:hint="default"/>
+        <w:sz w:val="20"/>
+      </w:rPr>
+    </w:lvl>
+    <w:lvl w:ilvl="1" w:tentative="1">
+      <w:start w:val="1"/>
+      <w:numFmt w:val="bullet"/>
+      <w:lvlText w:val="o"/>
+      <w:lvlJc w:val="left"/>
+      <w:pPr>
+        <w:tabs>
+          <w:tab w:val="num" w:pos="1440"/>
+        </w:tabs>
+        <w:ind w:left="1440" w:hanging="360"/>
+      </w:pPr>
+      <w:rPr>
+        <w:rFonts w:ascii="Courier New" w:hAnsi="Courier New" w:hint="default"/>
+        <w:sz w:val="20"/>
+      </w:rPr>
+    </w:lvl>
+    <w:lvl w:ilvl="2" w:tentative="1">
+      <w:start w:val="1"/>
+      <w:numFmt w:val="bullet"/>
+      <w:lvlText w:val=""/>
+      <w:lvlJc w:val="left"/>
+      <w:pPr>
+        <w:tabs>
+          <w:tab w:val="num" w:pos="2160"/>
+        </w:tabs>
+        <w:ind w:left="2160" w:hanging="360"/>
+      </w:pPr>
+      <w:rPr>
+        <w:rFonts w:ascii="Wingdings" w:hAnsi="Wingdings" w:hint="default"/>
+        <w:sz w:val="20"/>
+      </w:rPr>
+    </w:lvl>
+    <w:lvl w:ilvl="3" w:tentative="1">
+      <w:start w:val="1"/>
+      <w:numFmt w:val="bullet"/>
+      <w:lvlText w:val=""/>
+      <w:lvlJc w:val="left"/>
+      <w:pPr>
+        <w:tabs>
+          <w:tab w:val="num" w:pos="2880"/>
+        </w:tabs>
+        <w:ind w:left="2880" w:hanging="360"/>
+      </w:pPr>
+      <w:rPr>
+        <w:rFonts w:ascii="Wingdings" w:hAnsi="Wingdings" w:hint="default"/>
+        <w:sz w:val="20"/>
+      </w:rPr>
+    </w:lvl>
+    <w:lvl w:ilvl="4" w:tentative="1">
+      <w:start w:val="1"/>
+      <w:numFmt w:val="bullet"/>
+      <w:lvlText w:val=""/>
+      <w:lvlJc w:val="left"/>
+      <w:pPr>
+        <w:tabs>
+          <w:tab w:val="num" w:pos="3600"/>
+        </w:tabs>
+        <w:ind w:left="3600" w:hanging="360"/>
+      </w:pPr>
+      <w:rPr>
+        <w:rFonts w:ascii="Wingdings" w:hAnsi="Wingdings" w:hint="default"/>
+        <w:sz w:val="20"/>
+      </w:rPr>
+    </w:lvl>
+    <w:lvl w:ilvl="5" w:tentative="1">
+      <w:start w:val="1"/>
+      <w:numFmt w:val="bullet"/>
+      <w:lvlText w:val=""/>
+      <w:lvlJc w:val="left"/>
+      <w:pPr>
+        <w:tabs>
+          <w:tab w:val="num" w:pos="4320"/>
+        </w:tabs>
+        <w:ind w:left="4320" w:hanging="360"/>
+      </w:pPr>
+      <w:rPr>
+        <w:rFonts w:ascii="Wingdings" w:hAnsi="Wingdings" w:hint="default"/>
+        <w:sz w:val="20"/>
+      </w:rPr>
+    </w:lvl>
+    <w:lvl w:ilvl="6" w:tentative="1">
+      <w:start w:val="1"/>
+      <w:numFmt w:val="bullet"/>
+      <w:lvlText w:val=""/>
+      <w:lvlJc w:val="left"/>
+      <w:pPr>
+        <w:tabs>
+          <w:tab w:val="num" w:pos="5040"/>
+        </w:tabs>
+        <w:ind w:left="5040" w:hanging="360"/>
+      </w:pPr>
+      <w:rPr>
+        <w:rFonts w:ascii="Wingdings" w:hAnsi="Wingdings" w:hint="default"/>
+        <w:sz w:val="20"/>
+      </w:rPr>
+    </w:lvl>
+    <w:lvl w:ilvl="7" w:tentative="1">
+      <w:start w:val="1"/>
+      <w:numFmt w:val="bullet"/>
+      <w:lvlText w:val=""/>
+      <w:lvlJc w:val="left"/>
+      <w:pPr>
+        <w:tabs>
+          <w:tab w:val="num" w:pos="5760"/>
+        </w:tabs>
+        <w:ind w:left="5760" w:hanging="360"/>
+      </w:pPr>
+      <w:rPr>
+        <w:rFonts w:ascii="Wingdings" w:hAnsi="Wingdings" w:hint="default"/>
+        <w:sz w:val="20"/>
+      </w:rPr>
+    </w:lvl>
+    <w:lvl w:ilvl="8" w:tentative="1">
+      <w:start w:val="1"/>
+      <w:numFmt w:val="bullet"/>
+      <w:lvlText w:val=""/>
+      <w:lvlJc w:val="left"/>
+      <w:pPr>
+        <w:tabs>
+          <w:tab w:val="num" w:pos="6480"/>
+        </w:tabs>
+        <w:ind w:left="6480" w:hanging="360"/>
+      </w:pPr>
+      <w:rPr>
+        <w:rFonts w:ascii="Wingdings" w:hAnsi="Wingdings" w:hint="default"/>
+        <w:sz w:val="20"/>
+      </w:rPr>
+    </w:lvl>
+  </w:abstractNum>
   <w:num w:numId="1" w16cid:durableId="897862257">
     <w:abstractNumId w:val="0"/>
+  </w:num>
+  <w:num w:numId="2" w16cid:durableId="1518082037">
+    <w:abstractNumId w:val="3"/>
+  </w:num>
+  <w:num w:numId="3" w16cid:durableId="1398671455">
+    <w:abstractNumId w:val="1"/>
+  </w:num>
+  <w:num w:numId="4" w16cid:durableId="1848672252">
+    <w:abstractNumId w:val="2"/>
   </w:num>
 </w:numbering>
 </file>
 
 <file path=word/styles.xml><?xml version="1.0" encoding="utf-8"?>
-<w:styles xmlns:mc="http://schemas.openxmlformats.org/markup-compatibility/2006" xmlns:r="http://schemas.openxmlformats.org/officeDocument/2006/relationships" xmlns:w="http://schemas.openxmlformats.org/wordprocessingml/2006/main" xmlns:w14="http://schemas.microsoft.com/office/word/2010/wordml" xmlns:w15="http://schemas.microsoft.com/office/word/2012/wordml" xmlns:w16cex="http://schemas.microsoft.com/office/word/2018/wordml/cex" xmlns:w16cid="http://schemas.microsoft.com/office/word/2016/wordml/cid" xmlns:w16="http://schemas.microsoft.com/office/word/2018/wordml" xmlns:w16du="http://schemas.microsoft.com/office/word/2023/wordml/word16du" xmlns:w16sdtdh="http://schemas.microsoft.com/office/word/2020/wordml/sdtdatahash" xmlns:w16sdtfl="http://schemas.microsoft.com/office/word/2024/wordml/sdtformatlock" xmlns:w16se="http://schemas.microsoft.com/office/word/2015/wordml/symex" mc:Ignorable="w14 w15 w16se w16cid w16 w16cex w16sdtdh w16sdtfl w16du">
+<w:styles xmlns:mc="http://schemas.openxmlformats.org/markup-compatibility/2006" xmlns:r="http://schemas.openxmlformats.org/officeDocument/2006/relationships" xmlns:w="http://schemas.openxmlformats.org/wordprocessingml/2006/main" xmlns:w14="http://schemas.microsoft.com/office/word/2010/wordml" xmlns:w15="http://schemas.microsoft.com/office/word/2012/wordml" xmlns:w16cex="http://schemas.microsoft.com/office/word/2018/wordml/cex" xmlns:w16cid="http://schemas.microsoft.com/office/word/2016/wordml/cid" xmlns:w16="http://schemas.microsoft.com/office/word/2018/wordml" xmlns:w16sdtdh="http://schemas.microsoft.com/office/word/2020/wordml/sdtdatahash" xmlns:w16se="http://schemas.microsoft.com/office/word/2015/wordml/symex" mc:Ignorable="w14 w15 w16se w16cid w16 w16cex w16sdtdh">
   <w:docDefaults>
     <w:rPrDefault>
       <w:rPr>
@@ -3567,7 +5168,6 @@
   <w:style w:type="character" w:default="1" w:styleId="Fontepargpadro">
     <w:name w:val="Default Paragraph Font"/>
     <w:uiPriority w:val="1"/>
-    <w:semiHidden/>
     <w:unhideWhenUsed/>
   </w:style>
   <w:style w:type="table" w:default="1" w:styleId="Tabelanormal">
@@ -3634,6 +5234,29 @@
     <w:link w:val="Rodap"/>
     <w:uiPriority w:val="99"/>
     <w:rsid w:val="000425C6"/>
+  </w:style>
+  <w:style w:type="character" w:styleId="Hyperlink">
+    <w:name w:val="Hyperlink"/>
+    <w:basedOn w:val="Fontepargpadro"/>
+    <w:uiPriority w:val="99"/>
+    <w:unhideWhenUsed/>
+    <w:rsid w:val="00FF6C10"/>
+    <w:rPr>
+      <w:color w:val="0563C1" w:themeColor="hyperlink"/>
+      <w:u w:val="single"/>
+    </w:rPr>
+  </w:style>
+  <w:style w:type="character" w:styleId="MenoPendente">
+    <w:name w:val="Unresolved Mention"/>
+    <w:basedOn w:val="Fontepargpadro"/>
+    <w:uiPriority w:val="99"/>
+    <w:semiHidden/>
+    <w:unhideWhenUsed/>
+    <w:rsid w:val="00FF6C10"/>
+    <w:rPr>
+      <w:color w:val="605E5C"/>
+      <w:shd w:val="clear" w:color="auto" w:fill="E1DFDD"/>
+    </w:rPr>
   </w:style>
 </w:styles>
 </file>
@@ -3934,6 +5557,26 @@
 </file>
 
 <file path=customXml/item1.xml><?xml version="1.0" encoding="utf-8"?>
+<?mso-contentType ?>
+<FormTemplates xmlns="http://schemas.microsoft.com/sharepoint/v3/contenttype/forms">
+  <Display>DocumentLibraryForm</Display>
+  <Edit>DocumentLibraryForm</Edit>
+  <New>DocumentLibraryForm</New>
+</FormTemplates>
+</file>
+
+<file path=customXml/item2.xml><?xml version="1.0" encoding="utf-8"?>
+<p:properties xmlns:p="http://schemas.microsoft.com/office/2006/metadata/properties" xmlns:xsi="http://www.w3.org/2001/XMLSchema-instance" xmlns:pc="http://schemas.microsoft.com/office/infopath/2007/PartnerControls">
+  <documentManagement>
+    <lcf76f155ced4ddcb4097134ff3c332f xmlns="8ca2a57e-8138-4b57-956a-eb6e2c7049cc">
+      <Terms xmlns="http://schemas.microsoft.com/office/infopath/2007/PartnerControls"/>
+    </lcf76f155ced4ddcb4097134ff3c332f>
+    <TaxCatchAll xmlns="1d2798d9-1030-4cc5-be7b-200f9e628651" xsi:nil="true"/>
+  </documentManagement>
+</p:properties>
+</file>
+
+<file path=customXml/item3.xml><?xml version="1.0" encoding="utf-8"?>
 <ct:contentTypeSchema xmlns:ct="http://schemas.microsoft.com/office/2006/metadata/contentType" xmlns:ma="http://schemas.microsoft.com/office/2006/metadata/properties/metaAttributes" ct:_="" ma:_="" ma:contentTypeName="Documento" ma:contentTypeID="0x01010045364877AF745B4281652B53F43C594A" ma:contentTypeVersion="15" ma:contentTypeDescription="Crie um novo documento." ma:contentTypeScope="" ma:versionID="440a6fbbcbce65e3f8e2bed610644788">
   <xsd:schema xmlns:xsd="http://www.w3.org/2001/XMLSchema" xmlns:xs="http://www.w3.org/2001/XMLSchema" xmlns:p="http://schemas.microsoft.com/office/2006/metadata/properties" xmlns:ns2="1d2798d9-1030-4cc5-be7b-200f9e628651" xmlns:ns3="8ca2a57e-8138-4b57-956a-eb6e2c7049cc" targetNamespace="http://schemas.microsoft.com/office/2006/metadata/properties" ma:root="true" ma:fieldsID="3ff20d9b6411658b7762fa2c08d7e1af" ns2:_="" ns3:_="">
     <xsd:import namespace="1d2798d9-1030-4cc5-be7b-200f9e628651"/>
@@ -4168,27 +5811,26 @@
 </ct:contentTypeSchema>
 </file>
 
-<file path=customXml/item2.xml><?xml version="1.0" encoding="utf-8"?>
-<p:properties xmlns:p="http://schemas.microsoft.com/office/2006/metadata/properties" xmlns:xsi="http://www.w3.org/2001/XMLSchema-instance" xmlns:pc="http://schemas.microsoft.com/office/infopath/2007/PartnerControls">
-  <documentManagement>
-    <lcf76f155ced4ddcb4097134ff3c332f xmlns="8ca2a57e-8138-4b57-956a-eb6e2c7049cc">
-      <Terms xmlns="http://schemas.microsoft.com/office/infopath/2007/PartnerControls"/>
-    </lcf76f155ced4ddcb4097134ff3c332f>
-    <TaxCatchAll xmlns="1d2798d9-1030-4cc5-be7b-200f9e628651" xsi:nil="true"/>
-  </documentManagement>
-</p:properties>
+<file path=customXml/itemProps1.xml><?xml version="1.0" encoding="utf-8"?>
+<ds:datastoreItem xmlns:ds="http://schemas.openxmlformats.org/officeDocument/2006/customXml" ds:itemID="{6C7D064E-B9B1-4DD1-96C1-B59BEDBDE508}">
+  <ds:schemaRefs>
+    <ds:schemaRef ds:uri="http://schemas.microsoft.com/sharepoint/v3/contenttype/forms"/>
+  </ds:schemaRefs>
+</ds:datastoreItem>
 </file>
 
-<file path=customXml/item3.xml><?xml version="1.0" encoding="utf-8"?>
-<?mso-contentType ?>
-<FormTemplates xmlns="http://schemas.microsoft.com/sharepoint/v3/contenttype/forms">
-  <Display>DocumentLibraryForm</Display>
-  <Edit>DocumentLibraryForm</Edit>
-  <New>DocumentLibraryForm</New>
-</FormTemplates>
+<file path=customXml/itemProps2.xml><?xml version="1.0" encoding="utf-8"?>
+<ds:datastoreItem xmlns:ds="http://schemas.openxmlformats.org/officeDocument/2006/customXml" ds:itemID="{DEC3F211-A3ED-4D74-812F-955FD328EBB9}">
+  <ds:schemaRefs>
+    <ds:schemaRef ds:uri="http://schemas.microsoft.com/office/2006/metadata/properties"/>
+    <ds:schemaRef ds:uri="http://schemas.microsoft.com/office/infopath/2007/PartnerControls"/>
+    <ds:schemaRef ds:uri="8ca2a57e-8138-4b57-956a-eb6e2c7049cc"/>
+    <ds:schemaRef ds:uri="1d2798d9-1030-4cc5-be7b-200f9e628651"/>
+  </ds:schemaRefs>
+</ds:datastoreItem>
 </file>
 
-<file path=customXml/itemProps1.xml><?xml version="1.0" encoding="utf-8"?>
+<file path=customXml/itemProps3.xml><?xml version="1.0" encoding="utf-8"?>
 <ds:datastoreItem xmlns:ds="http://schemas.openxmlformats.org/officeDocument/2006/customXml" ds:itemID="{5C49EB71-DCC6-4AD6-B283-AD28F75E5568}">
   <ds:schemaRefs>
     <ds:schemaRef ds:uri="http://schemas.microsoft.com/office/2006/metadata/contentType"/>
@@ -4205,23 +5847,4 @@
     <ds:schemaRef ds:uri="http://schemas.microsoft.com/internal/obd"/>
   </ds:schemaRefs>
 </ds:datastoreItem>
-</file>
-
-<file path=customXml/itemProps2.xml><?xml version="1.0" encoding="utf-8"?>
-<ds:datastoreItem xmlns:ds="http://schemas.openxmlformats.org/officeDocument/2006/customXml" ds:itemID="{DEC3F211-A3ED-4D74-812F-955FD328EBB9}">
-  <ds:schemaRefs>
-    <ds:schemaRef ds:uri="http://schemas.microsoft.com/office/2006/metadata/properties"/>
-    <ds:schemaRef ds:uri="http://schemas.microsoft.com/office/infopath/2007/PartnerControls"/>
-    <ds:schemaRef ds:uri="8ca2a57e-8138-4b57-956a-eb6e2c7049cc"/>
-    <ds:schemaRef ds:uri="1d2798d9-1030-4cc5-be7b-200f9e628651"/>
-  </ds:schemaRefs>
-</ds:datastoreItem>
-</file>
-
-<file path=customXml/itemProps3.xml><?xml version="1.0" encoding="utf-8"?>
-<ds:datastoreItem xmlns:ds="http://schemas.openxmlformats.org/officeDocument/2006/customXml" ds:itemID="{6C7D064E-B9B1-4DD1-96C1-B59BEDBDE508}">
-  <ds:schemaRefs>
-    <ds:schemaRef ds:uri="http://schemas.microsoft.com/sharepoint/v3/contenttype/forms"/>
-  </ds:schemaRefs>
-</ds:datastoreItem>
 </file>
</xml_diff>